<commit_message>
feat: Noite 2 - fichas de identificacao de roteador e cabo
Folha do aluno passa a ter 5 paginas: leitura guiada da etiqueta do
roteador (TL-WR840N e Archer C5 da bancada), luzes e perguntas de
tecnico, e ficha de identificacao de cabo Cat5e x Cat6. Tarefa da
semana alinhada no roteiro e nos slides.

Co-Authored-By: Claude Opus 5.5 <noreply@anthropic.com>
Claude-Session: https://claude.ai/code/session_017UWKnGnU4rSnDUBwGRiA1e
</commit_message>
<xml_diff>
--- a/Folha do Aluno - Redes 2 - Como a internet chega.docx
+++ b/Folha do Aluno - Redes 2 - Como a internet chega.docx
@@ -19,7 +19,7 @@
           <w:color w:val="555555"/>
           <w:sz w:val="20"/>
         </w:rPr>
-        <w:t>Redes de Computadores · Noite 2 · Curso FIC · CEJA Itapiranga · 1 de 3</w:t>
+        <w:t>Redes de Computadores · Noite 2 · Curso FIC · CEJA Itapiranga · 1 de 5</w:t>
       </w:r>
     </w:p>
     <w:p>
@@ -773,7 +773,7 @@
           <w:color w:val="555555"/>
           <w:sz w:val="20"/>
         </w:rPr>
-        <w:t>Role-play cliente/técnico · Noite 2 · 2 de 3</w:t>
+        <w:t>Role-play cliente/técnico · Noite 2 · 2 de 5</w:t>
       </w:r>
     </w:p>
     <w:p>
@@ -1274,7 +1274,7 @@
           <w:color w:val="0B5C5C"/>
           <w:sz w:val="44"/>
         </w:rPr>
-        <w:t>FICHA DE IDENTIFICAÇÃO</w:t>
+        <w:t>FICHA DE IDENTIFICAÇÃO · ROTEADOR</w:t>
       </w:r>
     </w:p>
     <w:p>
@@ -1284,7 +1284,7 @@
           <w:color w:val="555555"/>
           <w:sz w:val="20"/>
         </w:rPr>
-        <w:t>Equipamento de rede · Noite 2 · 3 de 3</w:t>
+        <w:t>Equipamento de rede · Noite 2 · 3 de 5</w:t>
       </w:r>
     </w:p>
     <w:p>
@@ -1305,7 +1305,7 @@
           <w:color w:val="C5362B"/>
           <w:sz w:val="20"/>
         </w:rPr>
-        <w:t>Como preencher: quase tudo está na etiqueta embaixo do aparelho. Não mexa em configuração nenhuma — hoje é só olhar, contar e anotar. NÃO anote senha de Wi-Fi nesta folha.</w:t>
+        <w:t>Como preencher: quase tudo está na etiqueta embaixo do aparelho. Não mexa em configuração nenhuma — hoje é só olhar, contar e anotar. NÃO anote a senha do Wi-Fi (Senha Wireless/PIN) nesta folha.</w:t>
       </w:r>
     </w:p>
     <w:p>
@@ -1318,7 +1318,21 @@
           <w:color w:val="0B5C5C"/>
           <w:sz w:val="24"/>
         </w:rPr>
-        <w:t>1  O aparelho da bancada</w:t>
+        <w:t>1  Aprendendo a ler a etiqueta</w:t>
+      </w:r>
+    </w:p>
+    <w:p>
+      <w:pPr>
+        <w:spacing w:after="80"/>
+      </w:pPr>
+      <w:r>
+        <w:rPr>
+          <w:b w:val="0"/>
+          <w:i/>
+          <w:color w:val="555555"/>
+          <w:sz w:val="20"/>
+        </w:rPr>
+        <w:t>A etiqueta muda de lugar e de palavra conforme o modelo. Use esta tabela como dicionário.</w:t>
       </w:r>
     </w:p>
     <w:tbl>
@@ -1334,7 +1348,352 @@
       <w:tr>
         <w:tc>
           <w:tcPr>
-            <w:tcW w:type="dxa" w:w="3969"/>
+            <w:tcW w:type="dxa" w:w="3685"/>
+            <w:shd w:val="clear" w:color="auto" w:fill="0B5C5C"/>
+          </w:tcPr>
+          <w:p>
+            <w:r/>
+            <w:r>
+              <w:rPr>
+                <w:b/>
+                <w:color w:val="FFFFFF"/>
+                <w:sz w:val="20"/>
+              </w:rPr>
+              <w:t>Na etiqueta está escrito…</w:t>
+            </w:r>
+          </w:p>
+        </w:tc>
+        <w:tc>
+          <w:tcPr>
+            <w:tcW w:type="dxa" w:w="6236"/>
+            <w:shd w:val="clear" w:color="auto" w:fill="0B5C5C"/>
+          </w:tcPr>
+          <w:p>
+            <w:r/>
+            <w:r>
+              <w:rPr>
+                <w:b/>
+                <w:color w:val="FFFFFF"/>
+                <w:sz w:val="20"/>
+              </w:rPr>
+              <w:t>Quer dizer</w:t>
+            </w:r>
+          </w:p>
+        </w:tc>
+      </w:tr>
+      <w:tr>
+        <w:tc>
+          <w:tcPr>
+            <w:tcW w:type="dxa" w:w="3685"/>
+          </w:tcPr>
+          <w:p>
+            <w:r/>
+            <w:r>
+              <w:rPr>
+                <w:sz w:val="20"/>
+              </w:rPr>
+              <w:t>Modelo / Model   ·   Ver: 4.1</w:t>
+            </w:r>
+          </w:p>
+        </w:tc>
+        <w:tc>
+          <w:tcPr>
+            <w:tcW w:type="dxa" w:w="6236"/>
+          </w:tcPr>
+          <w:p>
+            <w:r/>
+            <w:r>
+              <w:rPr>
+                <w:sz w:val="20"/>
+              </w:rPr>
+              <w:t>Nome do aparelho e a versão do hardware (importa na hora de baixar atualização)</w:t>
+            </w:r>
+          </w:p>
+        </w:tc>
+      </w:tr>
+      <w:tr>
+        <w:tc>
+          <w:tcPr>
+            <w:tcW w:type="dxa" w:w="3685"/>
+          </w:tcPr>
+          <w:p>
+            <w:r/>
+            <w:r>
+              <w:rPr>
+                <w:sz w:val="20"/>
+              </w:rPr>
+              <w:t>S/N</w:t>
+            </w:r>
+          </w:p>
+        </w:tc>
+        <w:tc>
+          <w:tcPr>
+            <w:tcW w:type="dxa" w:w="6236"/>
+          </w:tcPr>
+          <w:p>
+            <w:r/>
+            <w:r>
+              <w:rPr>
+                <w:sz w:val="20"/>
+              </w:rPr>
+              <w:t>Número de série: a “identidade” daquele aparelho, único no mundo</w:t>
+            </w:r>
+          </w:p>
+        </w:tc>
+      </w:tr>
+      <w:tr>
+        <w:tc>
+          <w:tcPr>
+            <w:tcW w:type="dxa" w:w="3685"/>
+          </w:tcPr>
+          <w:p>
+            <w:r/>
+            <w:r>
+              <w:rPr>
+                <w:sz w:val="20"/>
+              </w:rPr>
+              <w:t>MAC: 60-32-B1-…</w:t>
+            </w:r>
+          </w:p>
+        </w:tc>
+        <w:tc>
+          <w:tcPr>
+            <w:tcW w:type="dxa" w:w="6236"/>
+          </w:tcPr>
+          <w:p>
+            <w:r/>
+            <w:r>
+              <w:rPr>
+                <w:sz w:val="20"/>
+              </w:rPr>
+              <w:t>Endereço físico da placa de rede. Vamos usar na Noite 6</w:t>
+            </w:r>
+          </w:p>
+        </w:tc>
+      </w:tr>
+      <w:tr>
+        <w:tc>
+          <w:tcPr>
+            <w:tcW w:type="dxa" w:w="3685"/>
+          </w:tcPr>
+          <w:p>
+            <w:r/>
+            <w:r>
+              <w:rPr>
+                <w:sz w:val="20"/>
+              </w:rPr>
+              <w:t>SSID: TP-Link_5249</w:t>
+            </w:r>
+          </w:p>
+        </w:tc>
+        <w:tc>
+          <w:tcPr>
+            <w:tcW w:type="dxa" w:w="6236"/>
+          </w:tcPr>
+          <w:p>
+            <w:r/>
+            <w:r>
+              <w:rPr>
+                <w:sz w:val="20"/>
+              </w:rPr>
+              <w:t>Nome da rede Wi-Fi que sai de fábrica. Se tem um “_5G”, o aparelho tem duas faixas</w:t>
+            </w:r>
+          </w:p>
+        </w:tc>
+      </w:tr>
+      <w:tr>
+        <w:tc>
+          <w:tcPr>
+            <w:tcW w:type="dxa" w:w="3685"/>
+          </w:tcPr>
+          <w:p>
+            <w:r/>
+            <w:r>
+              <w:rPr>
+                <w:sz w:val="20"/>
+              </w:rPr>
+              <w:t>Acesso Padrão / Página de Configuração</w:t>
+            </w:r>
+          </w:p>
+        </w:tc>
+        <w:tc>
+          <w:tcPr>
+            <w:tcW w:type="dxa" w:w="6236"/>
+          </w:tcPr>
+          <w:p>
+            <w:r/>
+            <w:r>
+              <w:rPr>
+                <w:sz w:val="20"/>
+              </w:rPr>
+              <w:t>Endereço que se digita no navegador para configurar (ex.: tplinkwifi.net)</w:t>
+            </w:r>
+          </w:p>
+        </w:tc>
+      </w:tr>
+      <w:tr>
+        <w:tc>
+          <w:tcPr>
+            <w:tcW w:type="dxa" w:w="3685"/>
+          </w:tcPr>
+          <w:p>
+            <w:r/>
+            <w:r>
+              <w:rPr>
+                <w:sz w:val="20"/>
+              </w:rPr>
+              <w:t>Energia / Alimentação: 12V ⎓ 1A</w:t>
+            </w:r>
+          </w:p>
+        </w:tc>
+        <w:tc>
+          <w:tcPr>
+            <w:tcW w:type="dxa" w:w="6236"/>
+          </w:tcPr>
+          <w:p>
+            <w:r/>
+            <w:r>
+              <w:rPr>
+                <w:sz w:val="20"/>
+              </w:rPr>
+              <w:t>Tensão e corrente da fonte. Fonte errada pode queimar o aparelho</w:t>
+            </w:r>
+          </w:p>
+        </w:tc>
+      </w:tr>
+      <w:tr>
+        <w:tc>
+          <w:tcPr>
+            <w:tcW w:type="dxa" w:w="3685"/>
+          </w:tcPr>
+          <w:p>
+            <w:r/>
+            <w:r>
+              <w:rPr>
+                <w:sz w:val="20"/>
+              </w:rPr>
+              <w:t>N 300Mbps   ·   AC1200</w:t>
+            </w:r>
+          </w:p>
+        </w:tc>
+        <w:tc>
+          <w:tcPr>
+            <w:tcW w:type="dxa" w:w="6236"/>
+          </w:tcPr>
+          <w:p>
+            <w:r/>
+            <w:r>
+              <w:rPr>
+                <w:sz w:val="20"/>
+              </w:rPr>
+              <w:t>Velocidade máxima teórica do Wi-Fi somando as faixas</w:t>
+            </w:r>
+          </w:p>
+        </w:tc>
+      </w:tr>
+      <w:tr>
+        <w:tc>
+          <w:tcPr>
+            <w:tcW w:type="dxa" w:w="3685"/>
+          </w:tcPr>
+          <w:p>
+            <w:r/>
+            <w:r>
+              <w:rPr>
+                <w:sz w:val="20"/>
+              </w:rPr>
+              <w:t>Dual Band</w:t>
+            </w:r>
+          </w:p>
+        </w:tc>
+        <w:tc>
+          <w:tcPr>
+            <w:tcW w:type="dxa" w:w="6236"/>
+          </w:tcPr>
+          <w:p>
+            <w:r/>
+            <w:r>
+              <w:rPr>
+                <w:sz w:val="20"/>
+              </w:rPr>
+              <w:t>Tem Wi-Fi em 2,4 GHz e em 5 GHz</w:t>
+            </w:r>
+          </w:p>
+        </w:tc>
+      </w:tr>
+      <w:tr>
+        <w:tc>
+          <w:tcPr>
+            <w:tcW w:type="dxa" w:w="3685"/>
+          </w:tcPr>
+          <w:p>
+            <w:r/>
+            <w:r>
+              <w:rPr>
+                <w:sz w:val="20"/>
+              </w:rPr>
+              <w:t>Gigabit</w:t>
+            </w:r>
+          </w:p>
+        </w:tc>
+        <w:tc>
+          <w:tcPr>
+            <w:tcW w:type="dxa" w:w="6236"/>
+          </w:tcPr>
+          <w:p>
+            <w:r/>
+            <w:r>
+              <w:rPr>
+                <w:sz w:val="20"/>
+              </w:rPr>
+              <w:t>Portas de cabo de até 1000 Mbps. Sem essa palavra, em geral são de 100 Mbps</w:t>
+            </w:r>
+          </w:p>
+        </w:tc>
+      </w:tr>
+    </w:tbl>
+    <w:p>
+      <w:pPr>
+        <w:spacing w:before="200" w:after="120"/>
+      </w:pPr>
+      <w:r>
+        <w:rPr>
+          <w:b/>
+          <w:color w:val="0B5C5C"/>
+          <w:sz w:val="24"/>
+        </w:rPr>
+        <w:t>2  Os aparelhos da bancada</w:t>
+      </w:r>
+    </w:p>
+    <w:p>
+      <w:pPr>
+        <w:spacing w:after="80"/>
+      </w:pPr>
+      <w:r>
+        <w:rPr>
+          <w:b w:val="0"/>
+          <w:i/>
+          <w:color w:val="555555"/>
+          <w:sz w:val="20"/>
+        </w:rPr>
+        <w:t>Preencha uma coluna para cada roteador que passar pela sua mão.</w:t>
+      </w:r>
+    </w:p>
+    <w:tbl>
+      <w:tblPr>
+        <w:tblStyle w:val="LightGrid-Accent1"/>
+        <w:tblW w:type="auto" w:w="0"/>
+        <w:tblLook w:firstColumn="1" w:firstRow="1" w:lastColumn="0" w:lastRow="0" w:noHBand="0" w:noVBand="1" w:val="04A0"/>
+      </w:tblPr>
+      <w:tblGrid>
+        <w:gridCol w:w="3400"/>
+        <w:gridCol w:w="3400"/>
+        <w:gridCol w:w="3400"/>
+      </w:tblGrid>
+      <w:tr>
+        <w:tc>
+          <w:tcPr>
+            <w:tcW w:type="dxa" w:w="4252"/>
             <w:shd w:val="clear" w:color="auto" w:fill="0B5C5C"/>
           </w:tcPr>
           <w:p>
@@ -1351,7 +1710,7 @@
         </w:tc>
         <w:tc>
           <w:tcPr>
-            <w:tcW w:type="dxa" w:w="5953"/>
+            <w:tcW w:type="dxa" w:w="2835"/>
             <w:shd w:val="clear" w:color="auto" w:fill="0B5C5C"/>
           </w:tcPr>
           <w:p>
@@ -1362,18 +1721,35 @@
                 <w:color w:val="FFFFFF"/>
                 <w:sz w:val="20"/>
               </w:rPr>
-              <w:t>Sua resposta</w:t>
+              <w:t>Roteador A</w:t>
+            </w:r>
+          </w:p>
+        </w:tc>
+        <w:tc>
+          <w:tcPr>
+            <w:tcW w:type="dxa" w:w="2835"/>
+            <w:shd w:val="clear" w:color="auto" w:fill="0B5C5C"/>
+          </w:tcPr>
+          <w:p>
+            <w:r/>
+            <w:r>
+              <w:rPr>
+                <w:b/>
+                <w:color w:val="FFFFFF"/>
+                <w:sz w:val="20"/>
+              </w:rPr>
+              <w:t>Roteador B</w:t>
             </w:r>
           </w:p>
         </w:tc>
       </w:tr>
       <w:tr>
         <w:trPr>
-          <w:trHeight w:val="454"/>
+          <w:trHeight w:val="397"/>
         </w:trPr>
         <w:tc>
           <w:tcPr>
-            <w:tcW w:type="dxa" w:w="3969"/>
+            <w:tcW w:type="dxa" w:w="4252"/>
           </w:tcPr>
           <w:p>
             <w:r/>
@@ -1387,7 +1763,20 @@
         </w:tc>
         <w:tc>
           <w:tcPr>
-            <w:tcW w:type="dxa" w:w="5953"/>
+            <w:tcW w:type="dxa" w:w="2835"/>
+          </w:tcPr>
+          <w:p>
+            <w:r/>
+            <w:r>
+              <w:rPr>
+                <w:sz w:val="20"/>
+              </w:rPr>
+            </w:r>
+          </w:p>
+        </w:tc>
+        <w:tc>
+          <w:tcPr>
+            <w:tcW w:type="dxa" w:w="2835"/>
           </w:tcPr>
           <w:p>
             <w:r/>
@@ -1401,11 +1790,11 @@
       </w:tr>
       <w:tr>
         <w:trPr>
-          <w:trHeight w:val="454"/>
+          <w:trHeight w:val="397"/>
         </w:trPr>
         <w:tc>
           <w:tcPr>
-            <w:tcW w:type="dxa" w:w="3969"/>
+            <w:tcW w:type="dxa" w:w="4252"/>
           </w:tcPr>
           <w:p>
             <w:r/>
@@ -1413,13 +1802,26 @@
               <w:rPr>
                 <w:sz w:val="20"/>
               </w:rPr>
-              <w:t>Modelo</w:t>
+              <w:t>Modelo e versão (Ver)</w:t>
             </w:r>
           </w:p>
         </w:tc>
         <w:tc>
           <w:tcPr>
-            <w:tcW w:type="dxa" w:w="5953"/>
+            <w:tcW w:type="dxa" w:w="2835"/>
+          </w:tcPr>
+          <w:p>
+            <w:r/>
+            <w:r>
+              <w:rPr>
+                <w:sz w:val="20"/>
+              </w:rPr>
+            </w:r>
+          </w:p>
+        </w:tc>
+        <w:tc>
+          <w:tcPr>
+            <w:tcW w:type="dxa" w:w="2835"/>
           </w:tcPr>
           <w:p>
             <w:r/>
@@ -1433,11 +1835,101 @@
       </w:tr>
       <w:tr>
         <w:trPr>
-          <w:trHeight w:val="454"/>
+          <w:trHeight w:val="397"/>
         </w:trPr>
         <w:tc>
           <w:tcPr>
-            <w:tcW w:type="dxa" w:w="3969"/>
+            <w:tcW w:type="dxa" w:w="4252"/>
+          </w:tcPr>
+          <w:p>
+            <w:r/>
+            <w:r>
+              <w:rPr>
+                <w:sz w:val="20"/>
+              </w:rPr>
+              <w:t>Velocidade do Wi-Fi (N300, AC1200…)</w:t>
+            </w:r>
+          </w:p>
+        </w:tc>
+        <w:tc>
+          <w:tcPr>
+            <w:tcW w:type="dxa" w:w="2835"/>
+          </w:tcPr>
+          <w:p>
+            <w:r/>
+            <w:r>
+              <w:rPr>
+                <w:sz w:val="20"/>
+              </w:rPr>
+            </w:r>
+          </w:p>
+        </w:tc>
+        <w:tc>
+          <w:tcPr>
+            <w:tcW w:type="dxa" w:w="2835"/>
+          </w:tcPr>
+          <w:p>
+            <w:r/>
+            <w:r>
+              <w:rPr>
+                <w:sz w:val="20"/>
+              </w:rPr>
+            </w:r>
+          </w:p>
+        </w:tc>
+      </w:tr>
+      <w:tr>
+        <w:trPr>
+          <w:trHeight w:val="397"/>
+        </w:trPr>
+        <w:tc>
+          <w:tcPr>
+            <w:tcW w:type="dxa" w:w="4252"/>
+          </w:tcPr>
+          <w:p>
+            <w:r/>
+            <w:r>
+              <w:rPr>
+                <w:sz w:val="20"/>
+              </w:rPr>
+              <w:t>Uma faixa ou Dual Band? Quantos SSID na etiqueta?</w:t>
+            </w:r>
+          </w:p>
+        </w:tc>
+        <w:tc>
+          <w:tcPr>
+            <w:tcW w:type="dxa" w:w="2835"/>
+          </w:tcPr>
+          <w:p>
+            <w:r/>
+            <w:r>
+              <w:rPr>
+                <w:sz w:val="20"/>
+              </w:rPr>
+            </w:r>
+          </w:p>
+        </w:tc>
+        <w:tc>
+          <w:tcPr>
+            <w:tcW w:type="dxa" w:w="2835"/>
+          </w:tcPr>
+          <w:p>
+            <w:r/>
+            <w:r>
+              <w:rPr>
+                <w:sz w:val="20"/>
+              </w:rPr>
+            </w:r>
+          </w:p>
+        </w:tc>
+      </w:tr>
+      <w:tr>
+        <w:trPr>
+          <w:trHeight w:val="397"/>
+        </w:trPr>
+        <w:tc>
+          <w:tcPr>
+            <w:tcW w:type="dxa" w:w="4252"/>
           </w:tcPr>
           <w:p>
             <w:r/>
@@ -1451,7 +1943,20 @@
         </w:tc>
         <w:tc>
           <w:tcPr>
-            <w:tcW w:type="dxa" w:w="5953"/>
+            <w:tcW w:type="dxa" w:w="2835"/>
+          </w:tcPr>
+          <w:p>
+            <w:r/>
+            <w:r>
+              <w:rPr>
+                <w:sz w:val="20"/>
+              </w:rPr>
+            </w:r>
+          </w:p>
+        </w:tc>
+        <w:tc>
+          <w:tcPr>
+            <w:tcW w:type="dxa" w:w="2835"/>
           </w:tcPr>
           <w:p>
             <w:r/>
@@ -1465,11 +1970,11 @@
       </w:tr>
       <w:tr>
         <w:trPr>
-          <w:trHeight w:val="454"/>
+          <w:trHeight w:val="397"/>
         </w:trPr>
         <w:tc>
           <w:tcPr>
-            <w:tcW w:type="dxa" w:w="3969"/>
+            <w:tcW w:type="dxa" w:w="4252"/>
           </w:tcPr>
           <w:p>
             <w:r/>
@@ -1483,7 +1988,20 @@
         </w:tc>
         <w:tc>
           <w:tcPr>
-            <w:tcW w:type="dxa" w:w="5953"/>
+            <w:tcW w:type="dxa" w:w="2835"/>
+          </w:tcPr>
+          <w:p>
+            <w:r/>
+            <w:r>
+              <w:rPr>
+                <w:sz w:val="20"/>
+              </w:rPr>
+            </w:r>
+          </w:p>
+        </w:tc>
+        <w:tc>
+          <w:tcPr>
+            <w:tcW w:type="dxa" w:w="2835"/>
           </w:tcPr>
           <w:p>
             <w:r/>
@@ -1497,11 +2015,146 @@
       </w:tr>
       <w:tr>
         <w:trPr>
-          <w:trHeight w:val="454"/>
+          <w:trHeight w:val="397"/>
         </w:trPr>
         <w:tc>
           <w:tcPr>
-            <w:tcW w:type="dxa" w:w="3969"/>
+            <w:tcW w:type="dxa" w:w="4252"/>
+          </w:tcPr>
+          <w:p>
+            <w:r/>
+            <w:r>
+              <w:rPr>
+                <w:sz w:val="20"/>
+              </w:rPr>
+              <w:t>MAC</w:t>
+            </w:r>
+          </w:p>
+        </w:tc>
+        <w:tc>
+          <w:tcPr>
+            <w:tcW w:type="dxa" w:w="2835"/>
+          </w:tcPr>
+          <w:p>
+            <w:r/>
+            <w:r>
+              <w:rPr>
+                <w:sz w:val="20"/>
+              </w:rPr>
+            </w:r>
+          </w:p>
+        </w:tc>
+        <w:tc>
+          <w:tcPr>
+            <w:tcW w:type="dxa" w:w="2835"/>
+          </w:tcPr>
+          <w:p>
+            <w:r/>
+            <w:r>
+              <w:rPr>
+                <w:sz w:val="20"/>
+              </w:rPr>
+            </w:r>
+          </w:p>
+        </w:tc>
+      </w:tr>
+      <w:tr>
+        <w:trPr>
+          <w:trHeight w:val="397"/>
+        </w:trPr>
+        <w:tc>
+          <w:tcPr>
+            <w:tcW w:type="dxa" w:w="4252"/>
+          </w:tcPr>
+          <w:p>
+            <w:r/>
+            <w:r>
+              <w:rPr>
+                <w:sz w:val="20"/>
+              </w:rPr>
+              <w:t>Alimentação (V e A)</w:t>
+            </w:r>
+          </w:p>
+        </w:tc>
+        <w:tc>
+          <w:tcPr>
+            <w:tcW w:type="dxa" w:w="2835"/>
+          </w:tcPr>
+          <w:p>
+            <w:r/>
+            <w:r>
+              <w:rPr>
+                <w:sz w:val="20"/>
+              </w:rPr>
+            </w:r>
+          </w:p>
+        </w:tc>
+        <w:tc>
+          <w:tcPr>
+            <w:tcW w:type="dxa" w:w="2835"/>
+          </w:tcPr>
+          <w:p>
+            <w:r/>
+            <w:r>
+              <w:rPr>
+                <w:sz w:val="20"/>
+              </w:rPr>
+            </w:r>
+          </w:p>
+        </w:tc>
+      </w:tr>
+      <w:tr>
+        <w:trPr>
+          <w:trHeight w:val="397"/>
+        </w:trPr>
+        <w:tc>
+          <w:tcPr>
+            <w:tcW w:type="dxa" w:w="4252"/>
+          </w:tcPr>
+          <w:p>
+            <w:r/>
+            <w:r>
+              <w:rPr>
+                <w:sz w:val="20"/>
+              </w:rPr>
+              <w:t>Portas são Gigabit? (sim / não / não diz)</w:t>
+            </w:r>
+          </w:p>
+        </w:tc>
+        <w:tc>
+          <w:tcPr>
+            <w:tcW w:type="dxa" w:w="2835"/>
+          </w:tcPr>
+          <w:p>
+            <w:r/>
+            <w:r>
+              <w:rPr>
+                <w:sz w:val="20"/>
+              </w:rPr>
+            </w:r>
+          </w:p>
+        </w:tc>
+        <w:tc>
+          <w:tcPr>
+            <w:tcW w:type="dxa" w:w="2835"/>
+          </w:tcPr>
+          <w:p>
+            <w:r/>
+            <w:r>
+              <w:rPr>
+                <w:sz w:val="20"/>
+              </w:rPr>
+            </w:r>
+          </w:p>
+        </w:tc>
+      </w:tr>
+      <w:tr>
+        <w:trPr>
+          <w:trHeight w:val="397"/>
+        </w:trPr>
+        <w:tc>
+          <w:tcPr>
+            <w:tcW w:type="dxa" w:w="4252"/>
           </w:tcPr>
           <w:p>
             <w:r/>
@@ -1515,7 +2168,20 @@
         </w:tc>
         <w:tc>
           <w:tcPr>
-            <w:tcW w:type="dxa" w:w="5953"/>
+            <w:tcW w:type="dxa" w:w="2835"/>
+          </w:tcPr>
+          <w:p>
+            <w:r/>
+            <w:r>
+              <w:rPr>
+                <w:sz w:val="20"/>
+              </w:rPr>
+            </w:r>
+          </w:p>
+        </w:tc>
+        <w:tc>
+          <w:tcPr>
+            <w:tcW w:type="dxa" w:w="2835"/>
           </w:tcPr>
           <w:p>
             <w:r/>
@@ -1529,11 +2195,11 @@
       </w:tr>
       <w:tr>
         <w:trPr>
-          <w:trHeight w:val="454"/>
+          <w:trHeight w:val="397"/>
         </w:trPr>
         <w:tc>
           <w:tcPr>
-            <w:tcW w:type="dxa" w:w="3969"/>
+            <w:tcW w:type="dxa" w:w="4252"/>
           </w:tcPr>
           <w:p>
             <w:r/>
@@ -1547,7 +2213,20 @@
         </w:tc>
         <w:tc>
           <w:tcPr>
-            <w:tcW w:type="dxa" w:w="5953"/>
+            <w:tcW w:type="dxa" w:w="2835"/>
+          </w:tcPr>
+          <w:p>
+            <w:r/>
+            <w:r>
+              <w:rPr>
+                <w:sz w:val="20"/>
+              </w:rPr>
+            </w:r>
+          </w:p>
+        </w:tc>
+        <w:tc>
+          <w:tcPr>
+            <w:tcW w:type="dxa" w:w="2835"/>
           </w:tcPr>
           <w:p>
             <w:r/>
@@ -1561,11 +2240,11 @@
       </w:tr>
       <w:tr>
         <w:trPr>
-          <w:trHeight w:val="454"/>
+          <w:trHeight w:val="397"/>
         </w:trPr>
         <w:tc>
           <w:tcPr>
-            <w:tcW w:type="dxa" w:w="3969"/>
+            <w:tcW w:type="dxa" w:w="4252"/>
           </w:tcPr>
           <w:p>
             <w:r/>
@@ -1573,13 +2252,71 @@
               <w:rPr>
                 <w:sz w:val="20"/>
               </w:rPr>
-              <w:t>Tem antena? Quantas?</w:t>
+              <w:t>Antenas: quantas?</w:t>
             </w:r>
           </w:p>
         </w:tc>
         <w:tc>
           <w:tcPr>
-            <w:tcW w:type="dxa" w:w="5953"/>
+            <w:tcW w:type="dxa" w:w="2835"/>
+          </w:tcPr>
+          <w:p>
+            <w:r/>
+            <w:r>
+              <w:rPr>
+                <w:sz w:val="20"/>
+              </w:rPr>
+            </w:r>
+          </w:p>
+        </w:tc>
+        <w:tc>
+          <w:tcPr>
+            <w:tcW w:type="dxa" w:w="2835"/>
+          </w:tcPr>
+          <w:p>
+            <w:r/>
+            <w:r>
+              <w:rPr>
+                <w:sz w:val="20"/>
+              </w:rPr>
+            </w:r>
+          </w:p>
+        </w:tc>
+      </w:tr>
+      <w:tr>
+        <w:trPr>
+          <w:trHeight w:val="397"/>
+        </w:trPr>
+        <w:tc>
+          <w:tcPr>
+            <w:tcW w:type="dxa" w:w="4252"/>
+          </w:tcPr>
+          <w:p>
+            <w:r/>
+            <w:r>
+              <w:rPr>
+                <w:sz w:val="20"/>
+              </w:rPr>
+              <w:t>Tem etiqueta do provedor? Qual o código?</w:t>
+            </w:r>
+          </w:p>
+        </w:tc>
+        <w:tc>
+          <w:tcPr>
+            <w:tcW w:type="dxa" w:w="2835"/>
+          </w:tcPr>
+          <w:p>
+            <w:r/>
+            <w:r>
+              <w:rPr>
+                <w:sz w:val="20"/>
+              </w:rPr>
+            </w:r>
+          </w:p>
+        </w:tc>
+        <w:tc>
+          <w:tcPr>
+            <w:tcW w:type="dxa" w:w="2835"/>
           </w:tcPr>
           <w:p>
             <w:r/>
@@ -1593,6 +2330,38 @@
       </w:tr>
     </w:tbl>
     <w:p>
+      <w:r>
+        <w:br w:type="page"/>
+      </w:r>
+    </w:p>
+    <w:p>
+      <w:r>
+        <w:rPr>
+          <w:b/>
+          <w:color w:val="0B5C5C"/>
+          <w:sz w:val="44"/>
+        </w:rPr>
+        <w:t>FICHA DE IDENTIFICAÇÃO · ROTEADOR NA PRÁTICA</w:t>
+      </w:r>
+    </w:p>
+    <w:p>
+      <w:r>
+        <w:rPr>
+          <w:i/>
+          <w:color w:val="555555"/>
+          <w:sz w:val="20"/>
+        </w:rPr>
+        <w:t>Equipamento de rede · Noite 2 · 4 de 5</w:t>
+      </w:r>
+    </w:p>
+    <w:p>
+      <w:pPr>
+        <w:pBdr>
+          <w:bottom w:val="single" w:sz="6" w:space="1" w:color="888888"/>
+        </w:pBdr>
+      </w:pPr>
+    </w:p>
+    <w:p>
       <w:pPr>
         <w:spacing w:before="200" w:after="120"/>
       </w:pPr>
@@ -1602,7 +2371,7 @@
           <w:color w:val="0B5C5C"/>
           <w:sz w:val="24"/>
         </w:rPr>
-        <w:t>2  As luzes do painel</w:t>
+        <w:t>3  As luzes do painel</w:t>
       </w:r>
     </w:p>
     <w:p>
@@ -1616,7 +2385,7 @@
           <w:color w:val="555555"/>
           <w:sz w:val="20"/>
         </w:rPr>
-        <w:t>Ligue o aparelho e marque o que cada luz fez.</w:t>
+        <w:t>Ligue um dos aparelhos e marque o que cada luz fez.</w:t>
       </w:r>
     </w:p>
     <w:tbl>
@@ -1634,7 +2403,7 @@
       <w:tr>
         <w:tc>
           <w:tcPr>
-            <w:tcW w:type="dxa" w:w="2268"/>
+            <w:tcW w:type="dxa" w:w="2835"/>
             <w:shd w:val="clear" w:color="auto" w:fill="0B5C5C"/>
           </w:tcPr>
           <w:p>
@@ -1651,7 +2420,7 @@
         </w:tc>
         <w:tc>
           <w:tcPr>
-            <w:tcW w:type="dxa" w:w="2551"/>
+            <w:tcW w:type="dxa" w:w="2268"/>
             <w:shd w:val="clear" w:color="auto" w:fill="0B5C5C"/>
           </w:tcPr>
           <w:p>
@@ -1668,7 +2437,7 @@
         </w:tc>
         <w:tc>
           <w:tcPr>
-            <w:tcW w:type="dxa" w:w="2551"/>
+            <w:tcW w:type="dxa" w:w="2268"/>
             <w:shd w:val="clear" w:color="auto" w:fill="0B5C5C"/>
           </w:tcPr>
           <w:p>
@@ -1685,7 +2454,7 @@
         </w:tc>
         <w:tc>
           <w:tcPr>
-            <w:tcW w:type="dxa" w:w="2551"/>
+            <w:tcW w:type="dxa" w:w="2268"/>
             <w:shd w:val="clear" w:color="auto" w:fill="0B5C5C"/>
           </w:tcPr>
           <w:p>
@@ -1703,11 +2472,11 @@
       </w:tr>
       <w:tr>
         <w:trPr>
-          <w:trHeight w:val="454"/>
+          <w:trHeight w:val="397"/>
         </w:trPr>
         <w:tc>
           <w:tcPr>
-            <w:tcW w:type="dxa" w:w="2268"/>
+            <w:tcW w:type="dxa" w:w="2835"/>
           </w:tcPr>
           <w:p>
             <w:r/>
@@ -1715,13 +2484,13 @@
               <w:rPr>
                 <w:sz w:val="20"/>
               </w:rPr>
-              <w:t>Power</w:t>
+              <w:t>Power (energia)</w:t>
             </w:r>
           </w:p>
         </w:tc>
         <w:tc>
           <w:tcPr>
-            <w:tcW w:type="dxa" w:w="2551"/>
+            <w:tcW w:type="dxa" w:w="2268"/>
           </w:tcPr>
           <w:p>
             <w:r/>
@@ -1735,7 +2504,7 @@
         </w:tc>
         <w:tc>
           <w:tcPr>
-            <w:tcW w:type="dxa" w:w="2551"/>
+            <w:tcW w:type="dxa" w:w="2268"/>
           </w:tcPr>
           <w:p>
             <w:r/>
@@ -1749,7 +2518,7 @@
         </w:tc>
         <w:tc>
           <w:tcPr>
-            <w:tcW w:type="dxa" w:w="2551"/>
+            <w:tcW w:type="dxa" w:w="2268"/>
           </w:tcPr>
           <w:p>
             <w:r/>
@@ -1764,11 +2533,11 @@
       </w:tr>
       <w:tr>
         <w:trPr>
-          <w:trHeight w:val="454"/>
+          <w:trHeight w:val="397"/>
         </w:trPr>
         <w:tc>
           <w:tcPr>
-            <w:tcW w:type="dxa" w:w="2268"/>
+            <w:tcW w:type="dxa" w:w="2835"/>
           </w:tcPr>
           <w:p>
             <w:r/>
@@ -1776,13 +2545,13 @@
               <w:rPr>
                 <w:sz w:val="20"/>
               </w:rPr>
-              <w:t>Fibra / Internet</w:t>
+              <w:t>Internet / WAN (globo)</w:t>
             </w:r>
           </w:p>
         </w:tc>
         <w:tc>
           <w:tcPr>
-            <w:tcW w:type="dxa" w:w="2551"/>
+            <w:tcW w:type="dxa" w:w="2268"/>
           </w:tcPr>
           <w:p>
             <w:r/>
@@ -1796,7 +2565,7 @@
         </w:tc>
         <w:tc>
           <w:tcPr>
-            <w:tcW w:type="dxa" w:w="2551"/>
+            <w:tcW w:type="dxa" w:w="2268"/>
           </w:tcPr>
           <w:p>
             <w:r/>
@@ -1810,7 +2579,7 @@
         </w:tc>
         <w:tc>
           <w:tcPr>
-            <w:tcW w:type="dxa" w:w="2551"/>
+            <w:tcW w:type="dxa" w:w="2268"/>
           </w:tcPr>
           <w:p>
             <w:r/>
@@ -1825,11 +2594,11 @@
       </w:tr>
       <w:tr>
         <w:trPr>
-          <w:trHeight w:val="454"/>
+          <w:trHeight w:val="397"/>
         </w:trPr>
         <w:tc>
           <w:tcPr>
-            <w:tcW w:type="dxa" w:w="2268"/>
+            <w:tcW w:type="dxa" w:w="2835"/>
           </w:tcPr>
           <w:p>
             <w:r/>
@@ -1837,13 +2606,13 @@
               <w:rPr>
                 <w:sz w:val="20"/>
               </w:rPr>
-              <w:t>WLAN / Wi-Fi</w:t>
+              <w:t>Wi-Fi 2,4 GHz</w:t>
             </w:r>
           </w:p>
         </w:tc>
         <w:tc>
           <w:tcPr>
-            <w:tcW w:type="dxa" w:w="2551"/>
+            <w:tcW w:type="dxa" w:w="2268"/>
           </w:tcPr>
           <w:p>
             <w:r/>
@@ -1857,7 +2626,7 @@
         </w:tc>
         <w:tc>
           <w:tcPr>
-            <w:tcW w:type="dxa" w:w="2551"/>
+            <w:tcW w:type="dxa" w:w="2268"/>
           </w:tcPr>
           <w:p>
             <w:r/>
@@ -1871,7 +2640,7 @@
         </w:tc>
         <w:tc>
           <w:tcPr>
-            <w:tcW w:type="dxa" w:w="2551"/>
+            <w:tcW w:type="dxa" w:w="2268"/>
           </w:tcPr>
           <w:p>
             <w:r/>
@@ -1886,11 +2655,72 @@
       </w:tr>
       <w:tr>
         <w:trPr>
-          <w:trHeight w:val="454"/>
+          <w:trHeight w:val="397"/>
         </w:trPr>
         <w:tc>
           <w:tcPr>
+            <w:tcW w:type="dxa" w:w="2835"/>
+          </w:tcPr>
+          <w:p>
+            <w:r/>
+            <w:r>
+              <w:rPr>
+                <w:sz w:val="20"/>
+              </w:rPr>
+              <w:t>Wi-Fi 5 GHz (se tiver)</w:t>
+            </w:r>
+          </w:p>
+        </w:tc>
+        <w:tc>
+          <w:tcPr>
             <w:tcW w:type="dxa" w:w="2268"/>
+          </w:tcPr>
+          <w:p>
+            <w:r/>
+            <w:r>
+              <w:rPr>
+                <w:sz w:val="20"/>
+              </w:rPr>
+              <w:t>☐</w:t>
+            </w:r>
+          </w:p>
+        </w:tc>
+        <w:tc>
+          <w:tcPr>
+            <w:tcW w:type="dxa" w:w="2268"/>
+          </w:tcPr>
+          <w:p>
+            <w:r/>
+            <w:r>
+              <w:rPr>
+                <w:sz w:val="20"/>
+              </w:rPr>
+              <w:t>☐</w:t>
+            </w:r>
+          </w:p>
+        </w:tc>
+        <w:tc>
+          <w:tcPr>
+            <w:tcW w:type="dxa" w:w="2268"/>
+          </w:tcPr>
+          <w:p>
+            <w:r/>
+            <w:r>
+              <w:rPr>
+                <w:sz w:val="20"/>
+              </w:rPr>
+              <w:t>☐</w:t>
+            </w:r>
+          </w:p>
+        </w:tc>
+      </w:tr>
+      <w:tr>
+        <w:trPr>
+          <w:trHeight w:val="397"/>
+        </w:trPr>
+        <w:tc>
+          <w:tcPr>
+            <w:tcW w:type="dxa" w:w="2835"/>
           </w:tcPr>
           <w:p>
             <w:r/>
@@ -1904,7 +2734,7 @@
         </w:tc>
         <w:tc>
           <w:tcPr>
-            <w:tcW w:type="dxa" w:w="2551"/>
+            <w:tcW w:type="dxa" w:w="2268"/>
           </w:tcPr>
           <w:p>
             <w:r/>
@@ -1918,7 +2748,7 @@
         </w:tc>
         <w:tc>
           <w:tcPr>
-            <w:tcW w:type="dxa" w:w="2551"/>
+            <w:tcW w:type="dxa" w:w="2268"/>
           </w:tcPr>
           <w:p>
             <w:r/>
@@ -1932,7 +2762,7 @@
         </w:tc>
         <w:tc>
           <w:tcPr>
-            <w:tcW w:type="dxa" w:w="2551"/>
+            <w:tcW w:type="dxa" w:w="2268"/>
           </w:tcPr>
           <w:p>
             <w:r/>
@@ -1956,7 +2786,7 @@
           <w:color w:val="0B5C5C"/>
           <w:sz w:val="24"/>
         </w:rPr>
-        <w:t>3  Duas perguntas</w:t>
+        <w:t>4  Pense como técnico</w:t>
       </w:r>
     </w:p>
     <w:p>
@@ -1993,12 +2823,81 @@
       </w:r>
     </w:p>
     <w:p>
+      <w:pPr>
+        <w:spacing w:after="0"/>
+      </w:pPr>
+      <w:r>
+        <w:rPr>
+          <w:color w:val="555555"/>
+          <w:sz w:val="22"/>
+        </w:rPr>
+        <w:t>____________________________________________________________________________________________________</w:t>
+      </w:r>
+    </w:p>
+    <w:p>
       <w:r>
         <w:rPr>
           <w:b/>
           <w:sz w:val="22"/>
         </w:rPr>
-        <w:t>2. A luz de fibra está apagada. Onde está o problema, e por quê?</w:t>
+        <w:t>2. A fonte de um roteador pode ser usada no outro? Olhe a alimentação dos dois e explique.</w:t>
+      </w:r>
+    </w:p>
+    <w:p>
+      <w:pPr>
+        <w:spacing w:after="0"/>
+      </w:pPr>
+      <w:r>
+        <w:rPr>
+          <w:color w:val="555555"/>
+          <w:sz w:val="22"/>
+        </w:rPr>
+        <w:t>____________________________________________________________________________________________________</w:t>
+      </w:r>
+    </w:p>
+    <w:p>
+      <w:pPr>
+        <w:spacing w:after="0"/>
+      </w:pPr>
+      <w:r>
+        <w:rPr>
+          <w:color w:val="555555"/>
+          <w:sz w:val="22"/>
+        </w:rPr>
+        <w:t>____________________________________________________________________________________________________</w:t>
+      </w:r>
+    </w:p>
+    <w:p>
+      <w:pPr>
+        <w:spacing w:after="0"/>
+      </w:pPr>
+      <w:r>
+        <w:rPr>
+          <w:color w:val="555555"/>
+          <w:sz w:val="22"/>
+        </w:rPr>
+        <w:t>____________________________________________________________________________________________________</w:t>
+      </w:r>
+    </w:p>
+    <w:p>
+      <w:r>
+        <w:rPr>
+          <w:b/>
+          <w:sz w:val="22"/>
+        </w:rPr>
+        <w:t>3. O cliente tem plano de 300 Mega e liga o computador no cabo. Qual dos dois roteadores você indicaria? Por quê?</w:t>
+      </w:r>
+    </w:p>
+    <w:p>
+      <w:pPr>
+        <w:spacing w:after="0"/>
+      </w:pPr>
+      <w:r>
+        <w:rPr>
+          <w:color w:val="555555"/>
+          <w:sz w:val="22"/>
+        </w:rPr>
+        <w:t>____________________________________________________________________________________________________</w:t>
       </w:r>
     </w:p>
     <w:p>
@@ -2048,7 +2947,7 @@
         <w:rPr>
           <w:sz w:val="22"/>
         </w:rPr>
-        <w:t>Procure um cabo de rede em casa (ou qualquer cabo, se não achar) e anote o que está escrito na capa</w:t>
+        <w:t>Olhe a etiqueta do roteador da sua casa e anote marca, modelo, velocidade do Wi-Fi e se é Dual Band</w:t>
       </w:r>
     </w:p>
     <w:p>
@@ -2060,7 +2959,7 @@
         <w:rPr>
           <w:sz w:val="22"/>
         </w:rPr>
-        <w:t>Categoria, fabricante e a metragem (o número impresso a cada metro)</w:t>
+        <w:t>Não anote nem fotografe a senha — tampe com o dedo se for tirar foto</w:t>
       </w:r>
     </w:p>
     <w:p>
@@ -2072,7 +2971,1066 @@
         <w:rPr>
           <w:sz w:val="22"/>
         </w:rPr>
-        <w:t>Traga anotado — vamos comparar as capas na Noite 3</w:t>
+        <w:t>Traga anotado — vamos comparar os aparelhos da turma na Noite 3</w:t>
+      </w:r>
+    </w:p>
+    <w:p>
+      <w:r>
+        <w:br w:type="page"/>
+      </w:r>
+    </w:p>
+    <w:p>
+      <w:r>
+        <w:rPr>
+          <w:b/>
+          <w:color w:val="0B5C5C"/>
+          <w:sz w:val="44"/>
+        </w:rPr>
+        <w:t>FICHA DE IDENTIFICAÇÃO · CABO</w:t>
+      </w:r>
+    </w:p>
+    <w:p>
+      <w:r>
+        <w:rPr>
+          <w:i/>
+          <w:color w:val="555555"/>
+          <w:sz w:val="20"/>
+        </w:rPr>
+        <w:t>Equipamento de rede · Noite 2 · 5 de 5</w:t>
+      </w:r>
+    </w:p>
+    <w:p>
+      <w:pPr>
+        <w:pBdr>
+          <w:bottom w:val="single" w:sz="6" w:space="1" w:color="888888"/>
+        </w:pBdr>
+      </w:pPr>
+    </w:p>
+    <w:p>
+      <w:pPr>
+        <w:spacing w:after="80"/>
+      </w:pPr>
+      <w:r>
+        <w:rPr>
+          <w:b w:val="0"/>
+          <w:i/>
+          <w:color w:val="555555"/>
+          <w:sz w:val="20"/>
+        </w:rPr>
+        <w:t>O cabo não tem etiqueta embaixo: a etiqueta dele é a própria capa. O texto se repete ao longo do cabo — se estiver apagado num ponto, procure um metro adiante.</w:t>
+      </w:r>
+    </w:p>
+    <w:p>
+      <w:pPr>
+        <w:spacing w:before="200" w:after="120"/>
+      </w:pPr>
+      <w:r>
+        <w:rPr>
+          <w:b/>
+          <w:color w:val="0B5C5C"/>
+          <w:sz w:val="24"/>
+        </w:rPr>
+        <w:t>1  Lendo a capa, pedaço por pedaço</w:t>
+      </w:r>
+    </w:p>
+    <w:p>
+      <w:pPr>
+        <w:spacing w:after="80"/>
+      </w:pPr>
+      <w:r>
+        <w:rPr>
+          <w:b w:val="0"/>
+          <w:i/>
+          <w:color w:val="555555"/>
+          <w:sz w:val="20"/>
+        </w:rPr>
+        <w:t>Exemplo real de um cabo da bancada:</w:t>
+      </w:r>
+    </w:p>
+    <w:p>
+      <w:pPr>
+        <w:spacing w:after="80"/>
+      </w:pPr>
+      <w:r>
+        <w:rPr>
+          <w:b/>
+          <w:i w:val="0"/>
+          <w:color w:val="0B5C5C"/>
+          <w:sz w:val="24"/>
+        </w:rPr>
+        <w:t>115 m   MEGATRON   CABO LAN   U/UTP   CAT5e   4P×24AWG   NBR 14703   ANATEL</w:t>
+      </w:r>
+    </w:p>
+    <w:tbl>
+      <w:tblPr>
+        <w:tblStyle w:val="LightGrid-Accent1"/>
+        <w:tblW w:type="auto" w:w="0"/>
+        <w:tblLook w:firstColumn="1" w:firstRow="1" w:lastColumn="0" w:lastRow="0" w:noHBand="0" w:noVBand="1" w:val="04A0"/>
+      </w:tblPr>
+      <w:tblGrid>
+        <w:gridCol w:w="5100"/>
+        <w:gridCol w:w="5100"/>
+      </w:tblGrid>
+      <w:tr>
+        <w:tc>
+          <w:tcPr>
+            <w:tcW w:type="dxa" w:w="2551"/>
+            <w:shd w:val="clear" w:color="auto" w:fill="0B5C5C"/>
+          </w:tcPr>
+          <w:p>
+            <w:r/>
+            <w:r>
+              <w:rPr>
+                <w:b/>
+                <w:color w:val="FFFFFF"/>
+                <w:sz w:val="20"/>
+              </w:rPr>
+              <w:t>Pedaço</w:t>
+            </w:r>
+          </w:p>
+        </w:tc>
+        <w:tc>
+          <w:tcPr>
+            <w:tcW w:type="dxa" w:w="7370"/>
+            <w:shd w:val="clear" w:color="auto" w:fill="0B5C5C"/>
+          </w:tcPr>
+          <w:p>
+            <w:r/>
+            <w:r>
+              <w:rPr>
+                <w:b/>
+                <w:color w:val="FFFFFF"/>
+                <w:sz w:val="20"/>
+              </w:rPr>
+              <w:t>Quer dizer</w:t>
+            </w:r>
+          </w:p>
+        </w:tc>
+      </w:tr>
+      <w:tr>
+        <w:tc>
+          <w:tcPr>
+            <w:tcW w:type="dxa" w:w="2551"/>
+          </w:tcPr>
+          <w:p>
+            <w:r/>
+            <w:r>
+              <w:rPr>
+                <w:sz w:val="20"/>
+              </w:rPr>
+              <w:t>115 m</w:t>
+            </w:r>
+          </w:p>
+        </w:tc>
+        <w:tc>
+          <w:tcPr>
+            <w:tcW w:type="dxa" w:w="7370"/>
+          </w:tcPr>
+          <w:p>
+            <w:r/>
+            <w:r>
+              <w:rPr>
+                <w:sz w:val="20"/>
+              </w:rPr>
+              <w:t>Metragem: a posição naquele ponto do rolo. Muda a cada metro</w:t>
+            </w:r>
+          </w:p>
+        </w:tc>
+      </w:tr>
+      <w:tr>
+        <w:tc>
+          <w:tcPr>
+            <w:tcW w:type="dxa" w:w="2551"/>
+          </w:tcPr>
+          <w:p>
+            <w:r/>
+            <w:r>
+              <w:rPr>
+                <w:sz w:val="20"/>
+              </w:rPr>
+              <w:t>MEGATRON</w:t>
+            </w:r>
+          </w:p>
+        </w:tc>
+        <w:tc>
+          <w:tcPr>
+            <w:tcW w:type="dxa" w:w="7370"/>
+          </w:tcPr>
+          <w:p>
+            <w:r/>
+            <w:r>
+              <w:rPr>
+                <w:sz w:val="20"/>
+              </w:rPr>
+              <w:t>Fabricante</w:t>
+            </w:r>
+          </w:p>
+        </w:tc>
+      </w:tr>
+      <w:tr>
+        <w:tc>
+          <w:tcPr>
+            <w:tcW w:type="dxa" w:w="2551"/>
+          </w:tcPr>
+          <w:p>
+            <w:r/>
+            <w:r>
+              <w:rPr>
+                <w:sz w:val="20"/>
+              </w:rPr>
+              <w:t>U/UTP</w:t>
+            </w:r>
+          </w:p>
+        </w:tc>
+        <w:tc>
+          <w:tcPr>
+            <w:tcW w:type="dxa" w:w="7370"/>
+          </w:tcPr>
+          <w:p>
+            <w:r/>
+            <w:r>
+              <w:rPr>
+                <w:sz w:val="20"/>
+              </w:rPr>
+              <w:t>Sem blindagem (Unshielded). Blindado aparece como F/UTP, S/FTP…</w:t>
+            </w:r>
+          </w:p>
+        </w:tc>
+      </w:tr>
+      <w:tr>
+        <w:tc>
+          <w:tcPr>
+            <w:tcW w:type="dxa" w:w="2551"/>
+          </w:tcPr>
+          <w:p>
+            <w:r/>
+            <w:r>
+              <w:rPr>
+                <w:sz w:val="20"/>
+              </w:rPr>
+              <w:t>CAT5e / CAT6</w:t>
+            </w:r>
+          </w:p>
+        </w:tc>
+        <w:tc>
+          <w:tcPr>
+            <w:tcW w:type="dxa" w:w="7370"/>
+          </w:tcPr>
+          <w:p>
+            <w:r/>
+            <w:r>
+              <w:rPr>
+                <w:sz w:val="20"/>
+              </w:rPr>
+              <w:t>Categoria: diz até quanto de velocidade o cabo aguenta com folga</w:t>
+            </w:r>
+          </w:p>
+        </w:tc>
+      </w:tr>
+      <w:tr>
+        <w:tc>
+          <w:tcPr>
+            <w:tcW w:type="dxa" w:w="2551"/>
+          </w:tcPr>
+          <w:p>
+            <w:r/>
+            <w:r>
+              <w:rPr>
+                <w:sz w:val="20"/>
+              </w:rPr>
+              <w:t>4P</w:t>
+            </w:r>
+          </w:p>
+        </w:tc>
+        <w:tc>
+          <w:tcPr>
+            <w:tcW w:type="dxa" w:w="7370"/>
+          </w:tcPr>
+          <w:p>
+            <w:r/>
+            <w:r>
+              <w:rPr>
+                <w:sz w:val="20"/>
+              </w:rPr>
+              <w:t>4 pares de fios trançados = 8 fios</w:t>
+            </w:r>
+          </w:p>
+        </w:tc>
+      </w:tr>
+      <w:tr>
+        <w:tc>
+          <w:tcPr>
+            <w:tcW w:type="dxa" w:w="2551"/>
+          </w:tcPr>
+          <w:p>
+            <w:r/>
+            <w:r>
+              <w:rPr>
+                <w:sz w:val="20"/>
+              </w:rPr>
+              <w:t>24AWG / 23AWG</w:t>
+            </w:r>
+          </w:p>
+        </w:tc>
+        <w:tc>
+          <w:tcPr>
+            <w:tcW w:type="dxa" w:w="7370"/>
+          </w:tcPr>
+          <w:p>
+            <w:r/>
+            <w:r>
+              <w:rPr>
+                <w:sz w:val="20"/>
+              </w:rPr>
+              <w:t>Espessura do fio de cobre. Quanto MENOR o número, MAIS GROSSO o fio</w:t>
+            </w:r>
+          </w:p>
+        </w:tc>
+      </w:tr>
+      <w:tr>
+        <w:tc>
+          <w:tcPr>
+            <w:tcW w:type="dxa" w:w="2551"/>
+          </w:tcPr>
+          <w:p>
+            <w:r/>
+            <w:r>
+              <w:rPr>
+                <w:sz w:val="20"/>
+              </w:rPr>
+              <w:t>NBR 14703 · ANATEL</w:t>
+            </w:r>
+          </w:p>
+        </w:tc>
+        <w:tc>
+          <w:tcPr>
+            <w:tcW w:type="dxa" w:w="7370"/>
+          </w:tcPr>
+          <w:p>
+            <w:r/>
+            <w:r>
+              <w:rPr>
+                <w:sz w:val="20"/>
+              </w:rPr>
+              <w:t>Segue a norma brasileira e é homologado</w:t>
+            </w:r>
+          </w:p>
+        </w:tc>
+      </w:tr>
+    </w:tbl>
+    <w:p>
+      <w:pPr>
+        <w:spacing w:before="200" w:after="120"/>
+      </w:pPr>
+      <w:r>
+        <w:rPr>
+          <w:b/>
+          <w:color w:val="0B5C5C"/>
+          <w:sz w:val="24"/>
+        </w:rPr>
+        <w:t>2  Os cabos da bancada</w:t>
+      </w:r>
+    </w:p>
+    <w:p>
+      <w:pPr>
+        <w:spacing w:after="80"/>
+      </w:pPr>
+      <w:r>
+        <w:rPr>
+          <w:b w:val="0"/>
+          <w:i/>
+          <w:color w:val="555555"/>
+          <w:sz w:val="20"/>
+        </w:rPr>
+        <w:t>Pegue um cabo Cat5e e um Cat6 e compare lado a lado.</w:t>
+      </w:r>
+    </w:p>
+    <w:tbl>
+      <w:tblPr>
+        <w:tblStyle w:val="LightGrid-Accent1"/>
+        <w:tblW w:type="auto" w:w="0"/>
+        <w:tblLook w:firstColumn="1" w:firstRow="1" w:lastColumn="0" w:lastRow="0" w:noHBand="0" w:noVBand="1" w:val="04A0"/>
+      </w:tblPr>
+      <w:tblGrid>
+        <w:gridCol w:w="3400"/>
+        <w:gridCol w:w="3400"/>
+        <w:gridCol w:w="3400"/>
+      </w:tblGrid>
+      <w:tr>
+        <w:tc>
+          <w:tcPr>
+            <w:tcW w:type="dxa" w:w="4252"/>
+            <w:shd w:val="clear" w:color="auto" w:fill="0B5C5C"/>
+          </w:tcPr>
+          <w:p>
+            <w:r/>
+            <w:r>
+              <w:rPr>
+                <w:b/>
+                <w:color w:val="FFFFFF"/>
+                <w:sz w:val="20"/>
+              </w:rPr>
+              <w:t>Item</w:t>
+            </w:r>
+          </w:p>
+        </w:tc>
+        <w:tc>
+          <w:tcPr>
+            <w:tcW w:type="dxa" w:w="2835"/>
+            <w:shd w:val="clear" w:color="auto" w:fill="0B5C5C"/>
+          </w:tcPr>
+          <w:p>
+            <w:r/>
+            <w:r>
+              <w:rPr>
+                <w:b/>
+                <w:color w:val="FFFFFF"/>
+                <w:sz w:val="20"/>
+              </w:rPr>
+              <w:t>Cabo 1</w:t>
+            </w:r>
+          </w:p>
+        </w:tc>
+        <w:tc>
+          <w:tcPr>
+            <w:tcW w:type="dxa" w:w="2835"/>
+            <w:shd w:val="clear" w:color="auto" w:fill="0B5C5C"/>
+          </w:tcPr>
+          <w:p>
+            <w:r/>
+            <w:r>
+              <w:rPr>
+                <w:b/>
+                <w:color w:val="FFFFFF"/>
+                <w:sz w:val="20"/>
+              </w:rPr>
+              <w:t>Cabo 2</w:t>
+            </w:r>
+          </w:p>
+        </w:tc>
+      </w:tr>
+      <w:tr>
+        <w:trPr>
+          <w:trHeight w:val="425"/>
+        </w:trPr>
+        <w:tc>
+          <w:tcPr>
+            <w:tcW w:type="dxa" w:w="4252"/>
+          </w:tcPr>
+          <w:p>
+            <w:r/>
+            <w:r>
+              <w:rPr>
+                <w:sz w:val="20"/>
+              </w:rPr>
+              <w:t>Fabricante</w:t>
+            </w:r>
+          </w:p>
+        </w:tc>
+        <w:tc>
+          <w:tcPr>
+            <w:tcW w:type="dxa" w:w="2835"/>
+          </w:tcPr>
+          <w:p>
+            <w:r/>
+            <w:r>
+              <w:rPr>
+                <w:sz w:val="20"/>
+              </w:rPr>
+            </w:r>
+          </w:p>
+        </w:tc>
+        <w:tc>
+          <w:tcPr>
+            <w:tcW w:type="dxa" w:w="2835"/>
+          </w:tcPr>
+          <w:p>
+            <w:r/>
+            <w:r>
+              <w:rPr>
+                <w:sz w:val="20"/>
+              </w:rPr>
+            </w:r>
+          </w:p>
+        </w:tc>
+      </w:tr>
+      <w:tr>
+        <w:trPr>
+          <w:trHeight w:val="425"/>
+        </w:trPr>
+        <w:tc>
+          <w:tcPr>
+            <w:tcW w:type="dxa" w:w="4252"/>
+          </w:tcPr>
+          <w:p>
+            <w:r/>
+            <w:r>
+              <w:rPr>
+                <w:sz w:val="20"/>
+              </w:rPr>
+              <w:t>Categoria (CAT…)</w:t>
+            </w:r>
+          </w:p>
+        </w:tc>
+        <w:tc>
+          <w:tcPr>
+            <w:tcW w:type="dxa" w:w="2835"/>
+          </w:tcPr>
+          <w:p>
+            <w:r/>
+            <w:r>
+              <w:rPr>
+                <w:sz w:val="20"/>
+              </w:rPr>
+            </w:r>
+          </w:p>
+        </w:tc>
+        <w:tc>
+          <w:tcPr>
+            <w:tcW w:type="dxa" w:w="2835"/>
+          </w:tcPr>
+          <w:p>
+            <w:r/>
+            <w:r>
+              <w:rPr>
+                <w:sz w:val="20"/>
+              </w:rPr>
+            </w:r>
+          </w:p>
+        </w:tc>
+      </w:tr>
+      <w:tr>
+        <w:trPr>
+          <w:trHeight w:val="425"/>
+        </w:trPr>
+        <w:tc>
+          <w:tcPr>
+            <w:tcW w:type="dxa" w:w="4252"/>
+          </w:tcPr>
+          <w:p>
+            <w:r/>
+            <w:r>
+              <w:rPr>
+                <w:sz w:val="20"/>
+              </w:rPr>
+              <w:t>Blindagem (U/UTP, F/UTP…)</w:t>
+            </w:r>
+          </w:p>
+        </w:tc>
+        <w:tc>
+          <w:tcPr>
+            <w:tcW w:type="dxa" w:w="2835"/>
+          </w:tcPr>
+          <w:p>
+            <w:r/>
+            <w:r>
+              <w:rPr>
+                <w:sz w:val="20"/>
+              </w:rPr>
+            </w:r>
+          </w:p>
+        </w:tc>
+        <w:tc>
+          <w:tcPr>
+            <w:tcW w:type="dxa" w:w="2835"/>
+          </w:tcPr>
+          <w:p>
+            <w:r/>
+            <w:r>
+              <w:rPr>
+                <w:sz w:val="20"/>
+              </w:rPr>
+            </w:r>
+          </w:p>
+        </w:tc>
+      </w:tr>
+      <w:tr>
+        <w:trPr>
+          <w:trHeight w:val="425"/>
+        </w:trPr>
+        <w:tc>
+          <w:tcPr>
+            <w:tcW w:type="dxa" w:w="4252"/>
+          </w:tcPr>
+          <w:p>
+            <w:r/>
+            <w:r>
+              <w:rPr>
+                <w:sz w:val="20"/>
+              </w:rPr>
+              <w:t>Quantos pares?</w:t>
+            </w:r>
+          </w:p>
+        </w:tc>
+        <w:tc>
+          <w:tcPr>
+            <w:tcW w:type="dxa" w:w="2835"/>
+          </w:tcPr>
+          <w:p>
+            <w:r/>
+            <w:r>
+              <w:rPr>
+                <w:sz w:val="20"/>
+              </w:rPr>
+            </w:r>
+          </w:p>
+        </w:tc>
+        <w:tc>
+          <w:tcPr>
+            <w:tcW w:type="dxa" w:w="2835"/>
+          </w:tcPr>
+          <w:p>
+            <w:r/>
+            <w:r>
+              <w:rPr>
+                <w:sz w:val="20"/>
+              </w:rPr>
+            </w:r>
+          </w:p>
+        </w:tc>
+      </w:tr>
+      <w:tr>
+        <w:trPr>
+          <w:trHeight w:val="425"/>
+        </w:trPr>
+        <w:tc>
+          <w:tcPr>
+            <w:tcW w:type="dxa" w:w="4252"/>
+          </w:tcPr>
+          <w:p>
+            <w:r/>
+            <w:r>
+              <w:rPr>
+                <w:sz w:val="20"/>
+              </w:rPr>
+              <w:t>Bitola (AWG)</w:t>
+            </w:r>
+          </w:p>
+        </w:tc>
+        <w:tc>
+          <w:tcPr>
+            <w:tcW w:type="dxa" w:w="2835"/>
+          </w:tcPr>
+          <w:p>
+            <w:r/>
+            <w:r>
+              <w:rPr>
+                <w:sz w:val="20"/>
+              </w:rPr>
+            </w:r>
+          </w:p>
+        </w:tc>
+        <w:tc>
+          <w:tcPr>
+            <w:tcW w:type="dxa" w:w="2835"/>
+          </w:tcPr>
+          <w:p>
+            <w:r/>
+            <w:r>
+              <w:rPr>
+                <w:sz w:val="20"/>
+              </w:rPr>
+            </w:r>
+          </w:p>
+        </w:tc>
+      </w:tr>
+      <w:tr>
+        <w:trPr>
+          <w:trHeight w:val="425"/>
+        </w:trPr>
+        <w:tc>
+          <w:tcPr>
+            <w:tcW w:type="dxa" w:w="4252"/>
+          </w:tcPr>
+          <w:p>
+            <w:r/>
+            <w:r>
+              <w:rPr>
+                <w:sz w:val="20"/>
+              </w:rPr>
+              <w:t>Norma / selo Anatel?</w:t>
+            </w:r>
+          </w:p>
+        </w:tc>
+        <w:tc>
+          <w:tcPr>
+            <w:tcW w:type="dxa" w:w="2835"/>
+          </w:tcPr>
+          <w:p>
+            <w:r/>
+            <w:r>
+              <w:rPr>
+                <w:sz w:val="20"/>
+              </w:rPr>
+            </w:r>
+          </w:p>
+        </w:tc>
+        <w:tc>
+          <w:tcPr>
+            <w:tcW w:type="dxa" w:w="2835"/>
+          </w:tcPr>
+          <w:p>
+            <w:r/>
+            <w:r>
+              <w:rPr>
+                <w:sz w:val="20"/>
+              </w:rPr>
+            </w:r>
+          </w:p>
+        </w:tc>
+      </w:tr>
+      <w:tr>
+        <w:trPr>
+          <w:trHeight w:val="425"/>
+        </w:trPr>
+        <w:tc>
+          <w:tcPr>
+            <w:tcW w:type="dxa" w:w="4252"/>
+          </w:tcPr>
+          <w:p>
+            <w:r/>
+            <w:r>
+              <w:rPr>
+                <w:sz w:val="20"/>
+              </w:rPr>
+              <w:t>Cor da capa</w:t>
+            </w:r>
+          </w:p>
+        </w:tc>
+        <w:tc>
+          <w:tcPr>
+            <w:tcW w:type="dxa" w:w="2835"/>
+          </w:tcPr>
+          <w:p>
+            <w:r/>
+            <w:r>
+              <w:rPr>
+                <w:sz w:val="20"/>
+              </w:rPr>
+            </w:r>
+          </w:p>
+        </w:tc>
+        <w:tc>
+          <w:tcPr>
+            <w:tcW w:type="dxa" w:w="2835"/>
+          </w:tcPr>
+          <w:p>
+            <w:r/>
+            <w:r>
+              <w:rPr>
+                <w:sz w:val="20"/>
+              </w:rPr>
+            </w:r>
+          </w:p>
+        </w:tc>
+      </w:tr>
+      <w:tr>
+        <w:trPr>
+          <w:trHeight w:val="425"/>
+        </w:trPr>
+        <w:tc>
+          <w:tcPr>
+            <w:tcW w:type="dxa" w:w="4252"/>
+          </w:tcPr>
+          <w:p>
+            <w:r/>
+            <w:r>
+              <w:rPr>
+                <w:sz w:val="20"/>
+              </w:rPr>
+              <w:t>Qual é mais grosso? (marque X)</w:t>
+            </w:r>
+          </w:p>
+        </w:tc>
+        <w:tc>
+          <w:tcPr>
+            <w:tcW w:type="dxa" w:w="2835"/>
+          </w:tcPr>
+          <w:p>
+            <w:r/>
+            <w:r>
+              <w:rPr>
+                <w:sz w:val="20"/>
+              </w:rPr>
+            </w:r>
+          </w:p>
+        </w:tc>
+        <w:tc>
+          <w:tcPr>
+            <w:tcW w:type="dxa" w:w="2835"/>
+          </w:tcPr>
+          <w:p>
+            <w:r/>
+            <w:r>
+              <w:rPr>
+                <w:sz w:val="20"/>
+              </w:rPr>
+            </w:r>
+          </w:p>
+        </w:tc>
+      </w:tr>
+      <w:tr>
+        <w:trPr>
+          <w:trHeight w:val="425"/>
+        </w:trPr>
+        <w:tc>
+          <w:tcPr>
+            <w:tcW w:type="dxa" w:w="4252"/>
+          </w:tcPr>
+          <w:p>
+            <w:r/>
+            <w:r>
+              <w:rPr>
+                <w:sz w:val="20"/>
+              </w:rPr>
+              <w:t>Na ponta cortada: tem um plástico separando os pares?</w:t>
+            </w:r>
+          </w:p>
+        </w:tc>
+        <w:tc>
+          <w:tcPr>
+            <w:tcW w:type="dxa" w:w="2835"/>
+          </w:tcPr>
+          <w:p>
+            <w:r/>
+            <w:r>
+              <w:rPr>
+                <w:sz w:val="20"/>
+              </w:rPr>
+            </w:r>
+          </w:p>
+        </w:tc>
+        <w:tc>
+          <w:tcPr>
+            <w:tcW w:type="dxa" w:w="2835"/>
+          </w:tcPr>
+          <w:p>
+            <w:r/>
+            <w:r>
+              <w:rPr>
+                <w:sz w:val="20"/>
+              </w:rPr>
+            </w:r>
+          </w:p>
+        </w:tc>
+      </w:tr>
+    </w:tbl>
+    <w:p>
+      <w:pPr>
+        <w:spacing w:before="200" w:after="120"/>
+      </w:pPr>
+      <w:r>
+        <w:rPr>
+          <w:b/>
+          <w:color w:val="0B5C5C"/>
+          <w:sz w:val="24"/>
+        </w:rPr>
+        <w:t>3  Quanto cabo tem aqui?</w:t>
+      </w:r>
+    </w:p>
+    <w:p>
+      <w:pPr>
+        <w:spacing w:after="80"/>
+      </w:pPr>
+      <w:r>
+        <w:rPr>
+          <w:b w:val="0"/>
+          <w:i/>
+          <w:color w:val="555555"/>
+          <w:sz w:val="20"/>
+        </w:rPr>
+        <w:t>Leia a metragem perto de uma ponta e perto da outra. A diferença é o comprimento do pedaço.</w:t>
+      </w:r>
+    </w:p>
+    <w:tbl>
+      <w:tblPr>
+        <w:tblStyle w:val="LightGrid-Accent1"/>
+        <w:tblW w:type="auto" w:w="0"/>
+        <w:tblLook w:firstColumn="1" w:firstRow="1" w:lastColumn="0" w:lastRow="0" w:noHBand="0" w:noVBand="1" w:val="04A0"/>
+      </w:tblPr>
+      <w:tblGrid>
+        <w:gridCol w:w="3400"/>
+        <w:gridCol w:w="3400"/>
+        <w:gridCol w:w="3400"/>
+      </w:tblGrid>
+      <w:tr>
+        <w:tc>
+          <w:tcPr>
+            <w:tcW w:type="dxa" w:w="3288"/>
+            <w:shd w:val="clear" w:color="auto" w:fill="0B5C5C"/>
+          </w:tcPr>
+          <w:p>
+            <w:r/>
+            <w:r>
+              <w:rPr>
+                <w:b/>
+                <w:color w:val="FFFFFF"/>
+                <w:sz w:val="20"/>
+              </w:rPr>
+              <w:t>Metragem na ponta A</w:t>
+            </w:r>
+          </w:p>
+        </w:tc>
+        <w:tc>
+          <w:tcPr>
+            <w:tcW w:type="dxa" w:w="3288"/>
+            <w:shd w:val="clear" w:color="auto" w:fill="0B5C5C"/>
+          </w:tcPr>
+          <w:p>
+            <w:r/>
+            <w:r>
+              <w:rPr>
+                <w:b/>
+                <w:color w:val="FFFFFF"/>
+                <w:sz w:val="20"/>
+              </w:rPr>
+              <w:t>Metragem na ponta B</w:t>
+            </w:r>
+          </w:p>
+        </w:tc>
+        <w:tc>
+          <w:tcPr>
+            <w:tcW w:type="dxa" w:w="3345"/>
+            <w:shd w:val="clear" w:color="auto" w:fill="0B5C5C"/>
+          </w:tcPr>
+          <w:p>
+            <w:r/>
+            <w:r>
+              <w:rPr>
+                <w:b/>
+                <w:color w:val="FFFFFF"/>
+                <w:sz w:val="20"/>
+              </w:rPr>
+              <w:t>Comprimento (B − A)</w:t>
+            </w:r>
+          </w:p>
+        </w:tc>
+      </w:tr>
+      <w:tr>
+        <w:trPr>
+          <w:trHeight w:val="510"/>
+        </w:trPr>
+        <w:tc>
+          <w:tcPr>
+            <w:tcW w:type="dxa" w:w="3288"/>
+          </w:tcPr>
+          <w:p>
+            <w:r/>
+            <w:r>
+              <w:rPr>
+                <w:sz w:val="20"/>
+              </w:rPr>
+              <w:t xml:space="preserve">              m</w:t>
+            </w:r>
+          </w:p>
+        </w:tc>
+        <w:tc>
+          <w:tcPr>
+            <w:tcW w:type="dxa" w:w="3288"/>
+          </w:tcPr>
+          <w:p>
+            <w:r/>
+            <w:r>
+              <w:rPr>
+                <w:sz w:val="20"/>
+              </w:rPr>
+              <w:t xml:space="preserve">              m</w:t>
+            </w:r>
+          </w:p>
+        </w:tc>
+        <w:tc>
+          <w:tcPr>
+            <w:tcW w:type="dxa" w:w="3345"/>
+          </w:tcPr>
+          <w:p>
+            <w:r/>
+            <w:r>
+              <w:rPr>
+                <w:sz w:val="20"/>
+              </w:rPr>
+              <w:t xml:space="preserve">              m</w:t>
+            </w:r>
+          </w:p>
+        </w:tc>
+      </w:tr>
+    </w:tbl>
+    <w:p>
+      <w:pPr>
+        <w:spacing w:before="200" w:after="120"/>
+      </w:pPr>
+      <w:r>
+        <w:rPr>
+          <w:b/>
+          <w:color w:val="0B5C5C"/>
+          <w:sz w:val="24"/>
+        </w:rPr>
+        <w:t>4  Pense como técnico</w:t>
+      </w:r>
+    </w:p>
+    <w:p>
+      <w:r>
+        <w:rPr>
+          <w:b/>
+          <w:sz w:val="22"/>
+        </w:rPr>
+        <w:t>1. O cliente vai contratar 1 Giga. O cabo Cat5e da parede serve, ou tem que trocar tudo? Por quê?</w:t>
+      </w:r>
+    </w:p>
+    <w:p>
+      <w:pPr>
+        <w:spacing w:after="0"/>
+      </w:pPr>
+      <w:r>
+        <w:rPr>
+          <w:color w:val="555555"/>
+          <w:sz w:val="22"/>
+        </w:rPr>
+        <w:t>____________________________________________________________________________________________________</w:t>
+      </w:r>
+    </w:p>
+    <w:p>
+      <w:pPr>
+        <w:spacing w:after="0"/>
+      </w:pPr>
+      <w:r>
+        <w:rPr>
+          <w:color w:val="555555"/>
+          <w:sz w:val="22"/>
+        </w:rPr>
+        <w:t>____________________________________________________________________________________________________</w:t>
+      </w:r>
+    </w:p>
+    <w:p>
+      <w:r>
+        <w:rPr>
+          <w:b/>
+          <w:sz w:val="22"/>
+        </w:rPr>
+        <w:t>2. Por que vale a pena ler a capa do cabo ANTES de comprar ou instalar?</w:t>
+      </w:r>
+    </w:p>
+    <w:p>
+      <w:pPr>
+        <w:spacing w:after="0"/>
+      </w:pPr>
+      <w:r>
+        <w:rPr>
+          <w:color w:val="555555"/>
+          <w:sz w:val="22"/>
+        </w:rPr>
+        <w:t>____________________________________________________________________________________________________</w:t>
+      </w:r>
+    </w:p>
+    <w:p>
+      <w:pPr>
+        <w:spacing w:after="0"/>
+      </w:pPr>
+      <w:r>
+        <w:rPr>
+          <w:color w:val="555555"/>
+          <w:sz w:val="22"/>
+        </w:rPr>
+        <w:t>____________________________________________________________________________________________________</w:t>
       </w:r>
     </w:p>
     <w:p/>

</xml_diff>

<commit_message>
feat: Noite 2 - cabo como +1 e slides das fichas
Cabo de rede entra como "+1" nos 5 equipamentos (slide proprio, quadro,
folha e resumo). Slides de leitura da etiqueta do roteador e da capa do
cabo antes da pratica, e tres slides "Conferindo a ficha" com os valores
reais (TL-WR840N x Archer C5, pense como tecnico, Cat5e x Cat6).

Co-Authored-By: Claude Opus 5.5 <noreply@anthropic.com>
Claude-Session: https://claude.ai/code/session_017UWKnGnU4rSnDUBwGRiA1e
</commit_message>
<xml_diff>
--- a/Folha do Aluno - Redes 2 - Como a internet chega.docx
+++ b/Folha do Aluno - Redes 2 - Como a internet chega.docx
@@ -206,7 +206,7 @@
           <w:color w:val="555555"/>
           <w:sz w:val="20"/>
         </w:rPr>
-        <w:t>Preencha durante a aula. Só um deles cria rede.</w:t>
+        <w:t>Preencha durante a aula. Só um deles cria rede. O cabo entra como +1: é o que liga todos.</w:t>
       </w:r>
     </w:p>
     <w:tbl>
@@ -538,6 +538,64 @@
                 <w:sz w:val="20"/>
               </w:rPr>
               <w:t>Placa de rede</w:t>
+            </w:r>
+          </w:p>
+        </w:tc>
+        <w:tc>
+          <w:tcPr>
+            <w:tcW w:type="dxa" w:w="1417"/>
+          </w:tcPr>
+          <w:p>
+            <w:r/>
+            <w:r>
+              <w:rPr>
+                <w:sz w:val="20"/>
+              </w:rPr>
+            </w:r>
+          </w:p>
+        </w:tc>
+        <w:tc>
+          <w:tcPr>
+            <w:tcW w:type="dxa" w:w="1417"/>
+          </w:tcPr>
+          <w:p>
+            <w:r/>
+            <w:r>
+              <w:rPr>
+                <w:sz w:val="20"/>
+              </w:rPr>
+            </w:r>
+          </w:p>
+        </w:tc>
+        <w:tc>
+          <w:tcPr>
+            <w:tcW w:type="dxa" w:w="4535"/>
+          </w:tcPr>
+          <w:p>
+            <w:r/>
+            <w:r>
+              <w:rPr>
+                <w:sz w:val="20"/>
+              </w:rPr>
+            </w:r>
+          </w:p>
+        </w:tc>
+      </w:tr>
+      <w:tr>
+        <w:trPr>
+          <w:trHeight w:val="624"/>
+        </w:trPr>
+        <w:tc>
+          <w:tcPr>
+            <w:tcW w:type="dxa" w:w="1984"/>
+          </w:tcPr>
+          <w:p>
+            <w:r/>
+            <w:r>
+              <w:rPr>
+                <w:sz w:val="20"/>
+              </w:rPr>
+              <w:t>+ Cabo de rede</w:t>
             </w:r>
           </w:p>
         </w:tc>

</xml_diff>

<commit_message>
feat: Noite 2 - ficha do modem de fibra (ONU)
</commit_message>
<xml_diff>
--- a/Folha do Aluno - Redes 2 - Como a internet chega.docx
+++ b/Folha do Aluno - Redes 2 - Como a internet chega.docx
@@ -19,7 +19,7 @@
           <w:color w:val="555555"/>
           <w:sz w:val="20"/>
         </w:rPr>
-        <w:t>Redes de Computadores · Noite 2 · Curso FIC · CEJA Itapiranga · 1 de 5</w:t>
+        <w:t>Redes de Computadores · Noite 2 · Curso FIC · CEJA Itapiranga · 1 de 6</w:t>
       </w:r>
     </w:p>
     <w:p>
@@ -831,7 +831,7 @@
           <w:color w:val="555555"/>
           <w:sz w:val="20"/>
         </w:rPr>
-        <w:t>Role-play cliente/técnico · Noite 2 · 2 de 5</w:t>
+        <w:t>Role-play cliente/técnico · Noite 2 · 2 de 6</w:t>
       </w:r>
     </w:p>
     <w:p>
@@ -1342,7 +1342,7 @@
           <w:color w:val="555555"/>
           <w:sz w:val="20"/>
         </w:rPr>
-        <w:t>Equipamento de rede · Noite 2 · 3 de 5</w:t>
+        <w:t>Equipamento de rede · Noite 2 · 3 de 6</w:t>
       </w:r>
     </w:p>
     <w:p>
@@ -2409,7 +2409,7 @@
           <w:color w:val="555555"/>
           <w:sz w:val="20"/>
         </w:rPr>
-        <w:t>Equipamento de rede · Noite 2 · 4 de 5</w:t>
+        <w:t>Equipamento de rede · Noite 2 · 4 de 6</w:t>
       </w:r>
     </w:p>
     <w:p>
@@ -3044,6 +3044,932 @@
           <w:color w:val="0B5C5C"/>
           <w:sz w:val="44"/>
         </w:rPr>
+        <w:t>FICHA DE IDENTIFICAÇÃO · MODEM DE FIBRA (ONU)</w:t>
+      </w:r>
+    </w:p>
+    <w:p>
+      <w:r>
+        <w:rPr>
+          <w:i/>
+          <w:color w:val="555555"/>
+          <w:sz w:val="20"/>
+        </w:rPr>
+        <w:t>Equipamento de rede · Noite 2 · 5 de 6</w:t>
+      </w:r>
+    </w:p>
+    <w:p>
+      <w:pPr>
+        <w:pBdr>
+          <w:bottom w:val="single" w:sz="6" w:space="1" w:color="888888"/>
+        </w:pBdr>
+      </w:pPr>
+    </w:p>
+    <w:p>
+      <w:pPr>
+        <w:spacing w:after="80"/>
+      </w:pPr>
+      <w:r>
+        <w:rPr>
+          <w:b/>
+          <w:i/>
+          <w:color w:val="C5362B"/>
+          <w:sz w:val="20"/>
+        </w:rPr>
+        <w:t>Na fibra, o “modem” se chama ONU: é a caixinha onde o cabo de fibra do provedor termina e vira sinal de rede. Temos dois modelos na bancada. NÃO anote senhas nesta folha — nem a do Wi-Fi, nem a de acesso.</w:t>
+      </w:r>
+    </w:p>
+    <w:p>
+      <w:pPr>
+        <w:spacing w:before="200" w:after="120"/>
+      </w:pPr>
+      <w:r>
+        <w:rPr>
+          <w:b/>
+          <w:color w:val="0B5C5C"/>
+          <w:sz w:val="24"/>
+        </w:rPr>
+        <w:t>1  O que muda na etiqueta da ONU</w:t>
+      </w:r>
+    </w:p>
+    <w:tbl>
+      <w:tblPr>
+        <w:tblStyle w:val="LightGrid-Accent1"/>
+        <w:tblW w:type="auto" w:w="0"/>
+        <w:tblLook w:firstColumn="1" w:firstRow="1" w:lastColumn="0" w:lastRow="0" w:noHBand="0" w:noVBand="1" w:val="04A0"/>
+      </w:tblPr>
+      <w:tblGrid>
+        <w:gridCol w:w="5100"/>
+        <w:gridCol w:w="5100"/>
+      </w:tblGrid>
+      <w:tr>
+        <w:tc>
+          <w:tcPr>
+            <w:tcW w:type="dxa" w:w="3685"/>
+            <w:shd w:val="clear" w:color="auto" w:fill="0B5C5C"/>
+          </w:tcPr>
+          <w:p>
+            <w:r/>
+            <w:r>
+              <w:rPr>
+                <w:b/>
+                <w:color w:val="FFFFFF"/>
+                <w:sz w:val="20"/>
+              </w:rPr>
+              <w:t>Na etiqueta está escrito…</w:t>
+            </w:r>
+          </w:p>
+        </w:tc>
+        <w:tc>
+          <w:tcPr>
+            <w:tcW w:type="dxa" w:w="6236"/>
+            <w:shd w:val="clear" w:color="auto" w:fill="0B5C5C"/>
+          </w:tcPr>
+          <w:p>
+            <w:r/>
+            <w:r>
+              <w:rPr>
+                <w:b/>
+                <w:color w:val="FFFFFF"/>
+                <w:sz w:val="20"/>
+              </w:rPr>
+              <w:t>Quer dizer</w:t>
+            </w:r>
+          </w:p>
+        </w:tc>
+      </w:tr>
+      <w:tr>
+        <w:tc>
+          <w:tcPr>
+            <w:tcW w:type="dxa" w:w="3685"/>
+          </w:tcPr>
+          <w:p>
+            <w:r/>
+            <w:r>
+              <w:rPr>
+                <w:sz w:val="20"/>
+              </w:rPr>
+              <w:t>GPON ONU</w:t>
+            </w:r>
+          </w:p>
+        </w:tc>
+        <w:tc>
+          <w:tcPr>
+            <w:tcW w:type="dxa" w:w="6236"/>
+          </w:tcPr>
+          <w:p>
+            <w:r/>
+            <w:r>
+              <w:rPr>
+                <w:sz w:val="20"/>
+              </w:rPr>
+              <w:t>Modem de fibra óptica (tecnologia GPON, a mais usada pelos provedores)</w:t>
+            </w:r>
+          </w:p>
+        </w:tc>
+      </w:tr>
+      <w:tr>
+        <w:tc>
+          <w:tcPr>
+            <w:tcW w:type="dxa" w:w="3685"/>
+          </w:tcPr>
+          <w:p>
+            <w:r/>
+            <w:r>
+              <w:rPr>
+                <w:sz w:val="20"/>
+              </w:rPr>
+              <w:t>GPON SN / S/N: FHTT…</w:t>
+            </w:r>
+          </w:p>
+        </w:tc>
+        <w:tc>
+          <w:tcPr>
+            <w:tcW w:type="dxa" w:w="6236"/>
+          </w:tcPr>
+          <w:p>
+            <w:r/>
+            <w:r>
+              <w:rPr>
+                <w:sz w:val="20"/>
+              </w:rPr>
+              <w:t>Número de série. É por ele que o provedor reconhece e libera o aparelho</w:t>
+            </w:r>
+          </w:p>
+        </w:tc>
+      </w:tr>
+      <w:tr>
+        <w:tc>
+          <w:tcPr>
+            <w:tcW w:type="dxa" w:w="3685"/>
+          </w:tcPr>
+          <w:p>
+            <w:r/>
+            <w:r>
+              <w:rPr>
+                <w:sz w:val="20"/>
+              </w:rPr>
+              <w:t>WLAN SSID / WLAN Security</w:t>
+            </w:r>
+          </w:p>
+        </w:tc>
+        <w:tc>
+          <w:tcPr>
+            <w:tcW w:type="dxa" w:w="6236"/>
+          </w:tcPr>
+          <w:p>
+            <w:r/>
+            <w:r>
+              <w:rPr>
+                <w:sz w:val="20"/>
+              </w:rPr>
+              <w:t>Nome e senha do Wi-Fi de fábrica. Se não aparece, o aparelho não tem Wi-Fi</w:t>
+            </w:r>
+          </w:p>
+        </w:tc>
+      </w:tr>
+      <w:tr>
+        <w:tc>
+          <w:tcPr>
+            <w:tcW w:type="dxa" w:w="3685"/>
+          </w:tcPr>
+          <w:p>
+            <w:r/>
+            <w:r>
+              <w:rPr>
+                <w:sz w:val="20"/>
+              </w:rPr>
+              <w:t>Terminal WEB IP: 192.168.1.1</w:t>
+            </w:r>
+          </w:p>
+        </w:tc>
+        <w:tc>
+          <w:tcPr>
+            <w:tcW w:type="dxa" w:w="6236"/>
+          </w:tcPr>
+          <w:p>
+            <w:r/>
+            <w:r>
+              <w:rPr>
+                <w:sz w:val="20"/>
+              </w:rPr>
+              <w:t>Endereço que se digita no navegador para configurar</w:t>
+            </w:r>
+          </w:p>
+        </w:tc>
+      </w:tr>
+      <w:tr>
+        <w:tc>
+          <w:tcPr>
+            <w:tcW w:type="dxa" w:w="3685"/>
+          </w:tcPr>
+          <w:p>
+            <w:r/>
+            <w:r>
+              <w:rPr>
+                <w:sz w:val="20"/>
+              </w:rPr>
+              <w:t>WEB user name / password</w:t>
+            </w:r>
+          </w:p>
+        </w:tc>
+        <w:tc>
+          <w:tcPr>
+            <w:tcW w:type="dxa" w:w="6236"/>
+          </w:tcPr>
+          <w:p>
+            <w:r/>
+            <w:r>
+              <w:rPr>
+                <w:sz w:val="20"/>
+              </w:rPr>
+              <w:t>Usuário e senha de acesso de fábrica. O técnico troca na instalação</w:t>
+            </w:r>
+          </w:p>
+        </w:tc>
+      </w:tr>
+      <w:tr>
+        <w:tc>
+          <w:tcPr>
+            <w:tcW w:type="dxa" w:w="3685"/>
+          </w:tcPr>
+          <w:p>
+            <w:r/>
+            <w:r>
+              <w:rPr>
+                <w:sz w:val="20"/>
+              </w:rPr>
+              <w:t>Conector verde (SC/APC)</w:t>
+            </w:r>
+          </w:p>
+        </w:tc>
+        <w:tc>
+          <w:tcPr>
+            <w:tcW w:type="dxa" w:w="6236"/>
+          </w:tcPr>
+          <w:p>
+            <w:r/>
+            <w:r>
+              <w:rPr>
+                <w:sz w:val="20"/>
+              </w:rPr>
+              <w:t>Onde entra a fibra. Não dobre o cabo e nunca olhe na ponta</w:t>
+            </w:r>
+          </w:p>
+        </w:tc>
+      </w:tr>
+    </w:tbl>
+    <w:p>
+      <w:pPr>
+        <w:spacing w:before="200" w:after="120"/>
+      </w:pPr>
+      <w:r>
+        <w:rPr>
+          <w:b/>
+          <w:color w:val="0B5C5C"/>
+          <w:sz w:val="24"/>
+        </w:rPr>
+        <w:t>2  Os dois modems da bancada</w:t>
+      </w:r>
+    </w:p>
+    <w:tbl>
+      <w:tblPr>
+        <w:tblStyle w:val="LightGrid-Accent1"/>
+        <w:tblW w:type="auto" w:w="0"/>
+        <w:tblLook w:firstColumn="1" w:firstRow="1" w:lastColumn="0" w:lastRow="0" w:noHBand="0" w:noVBand="1" w:val="04A0"/>
+      </w:tblPr>
+      <w:tblGrid>
+        <w:gridCol w:w="3400"/>
+        <w:gridCol w:w="3400"/>
+        <w:gridCol w:w="3400"/>
+      </w:tblGrid>
+      <w:tr>
+        <w:tc>
+          <w:tcPr>
+            <w:tcW w:type="dxa" w:w="4252"/>
+            <w:shd w:val="clear" w:color="auto" w:fill="0B5C5C"/>
+          </w:tcPr>
+          <w:p>
+            <w:r/>
+            <w:r>
+              <w:rPr>
+                <w:b/>
+                <w:color w:val="FFFFFF"/>
+                <w:sz w:val="20"/>
+              </w:rPr>
+              <w:t>Item</w:t>
+            </w:r>
+          </w:p>
+        </w:tc>
+        <w:tc>
+          <w:tcPr>
+            <w:tcW w:type="dxa" w:w="2835"/>
+            <w:shd w:val="clear" w:color="auto" w:fill="0B5C5C"/>
+          </w:tcPr>
+          <w:p>
+            <w:r/>
+            <w:r>
+              <w:rPr>
+                <w:b/>
+                <w:color w:val="FFFFFF"/>
+                <w:sz w:val="20"/>
+              </w:rPr>
+              <w:t>FiberHome HG6143D</w:t>
+            </w:r>
+          </w:p>
+        </w:tc>
+        <w:tc>
+          <w:tcPr>
+            <w:tcW w:type="dxa" w:w="2835"/>
+            <w:shd w:val="clear" w:color="auto" w:fill="0B5C5C"/>
+          </w:tcPr>
+          <w:p>
+            <w:r/>
+            <w:r>
+              <w:rPr>
+                <w:b/>
+                <w:color w:val="FFFFFF"/>
+                <w:sz w:val="20"/>
+              </w:rPr>
+              <w:t>FiberHome AN5506-02-B</w:t>
+            </w:r>
+          </w:p>
+        </w:tc>
+      </w:tr>
+      <w:tr>
+        <w:trPr>
+          <w:trHeight w:val="397"/>
+        </w:trPr>
+        <w:tc>
+          <w:tcPr>
+            <w:tcW w:type="dxa" w:w="4252"/>
+          </w:tcPr>
+          <w:p>
+            <w:r/>
+            <w:r>
+              <w:rPr>
+                <w:sz w:val="20"/>
+              </w:rPr>
+              <w:t>Cor e tamanho do aparelho</w:t>
+            </w:r>
+          </w:p>
+        </w:tc>
+        <w:tc>
+          <w:tcPr>
+            <w:tcW w:type="dxa" w:w="2835"/>
+          </w:tcPr>
+          <w:p>
+            <w:r/>
+            <w:r>
+              <w:rPr>
+                <w:sz w:val="20"/>
+              </w:rPr>
+            </w:r>
+          </w:p>
+        </w:tc>
+        <w:tc>
+          <w:tcPr>
+            <w:tcW w:type="dxa" w:w="2835"/>
+          </w:tcPr>
+          <w:p>
+            <w:r/>
+            <w:r>
+              <w:rPr>
+                <w:sz w:val="20"/>
+              </w:rPr>
+            </w:r>
+          </w:p>
+        </w:tc>
+      </w:tr>
+      <w:tr>
+        <w:trPr>
+          <w:trHeight w:val="397"/>
+        </w:trPr>
+        <w:tc>
+          <w:tcPr>
+            <w:tcW w:type="dxa" w:w="4252"/>
+          </w:tcPr>
+          <w:p>
+            <w:r/>
+            <w:r>
+              <w:rPr>
+                <w:sz w:val="20"/>
+              </w:rPr>
+              <w:t>Tem Wi-Fi? (tem SSID na etiqueta?)</w:t>
+            </w:r>
+          </w:p>
+        </w:tc>
+        <w:tc>
+          <w:tcPr>
+            <w:tcW w:type="dxa" w:w="2835"/>
+          </w:tcPr>
+          <w:p>
+            <w:r/>
+            <w:r>
+              <w:rPr>
+                <w:sz w:val="20"/>
+              </w:rPr>
+            </w:r>
+          </w:p>
+        </w:tc>
+        <w:tc>
+          <w:tcPr>
+            <w:tcW w:type="dxa" w:w="2835"/>
+          </w:tcPr>
+          <w:p>
+            <w:r/>
+            <w:r>
+              <w:rPr>
+                <w:sz w:val="20"/>
+              </w:rPr>
+            </w:r>
+          </w:p>
+        </w:tc>
+      </w:tr>
+      <w:tr>
+        <w:trPr>
+          <w:trHeight w:val="397"/>
+        </w:trPr>
+        <w:tc>
+          <w:tcPr>
+            <w:tcW w:type="dxa" w:w="4252"/>
+          </w:tcPr>
+          <w:p>
+            <w:r/>
+            <w:r>
+              <w:rPr>
+                <w:sz w:val="20"/>
+              </w:rPr>
+              <w:t>Uma faixa ou Dual Band?</w:t>
+            </w:r>
+          </w:p>
+        </w:tc>
+        <w:tc>
+          <w:tcPr>
+            <w:tcW w:type="dxa" w:w="2835"/>
+          </w:tcPr>
+          <w:p>
+            <w:r/>
+            <w:r>
+              <w:rPr>
+                <w:sz w:val="20"/>
+              </w:rPr>
+            </w:r>
+          </w:p>
+        </w:tc>
+        <w:tc>
+          <w:tcPr>
+            <w:tcW w:type="dxa" w:w="2835"/>
+          </w:tcPr>
+          <w:p>
+            <w:r/>
+            <w:r>
+              <w:rPr>
+                <w:sz w:val="20"/>
+              </w:rPr>
+            </w:r>
+          </w:p>
+        </w:tc>
+      </w:tr>
+      <w:tr>
+        <w:trPr>
+          <w:trHeight w:val="397"/>
+        </w:trPr>
+        <w:tc>
+          <w:tcPr>
+            <w:tcW w:type="dxa" w:w="4252"/>
+          </w:tcPr>
+          <w:p>
+            <w:r/>
+            <w:r>
+              <w:rPr>
+                <w:sz w:val="20"/>
+              </w:rPr>
+              <w:t>Endereço de configuração (se tiver)</w:t>
+            </w:r>
+          </w:p>
+        </w:tc>
+        <w:tc>
+          <w:tcPr>
+            <w:tcW w:type="dxa" w:w="2835"/>
+          </w:tcPr>
+          <w:p>
+            <w:r/>
+            <w:r>
+              <w:rPr>
+                <w:sz w:val="20"/>
+              </w:rPr>
+            </w:r>
+          </w:p>
+        </w:tc>
+        <w:tc>
+          <w:tcPr>
+            <w:tcW w:type="dxa" w:w="2835"/>
+          </w:tcPr>
+          <w:p>
+            <w:r/>
+            <w:r>
+              <w:rPr>
+                <w:sz w:val="20"/>
+              </w:rPr>
+            </w:r>
+          </w:p>
+        </w:tc>
+      </w:tr>
+      <w:tr>
+        <w:trPr>
+          <w:trHeight w:val="397"/>
+        </w:trPr>
+        <w:tc>
+          <w:tcPr>
+            <w:tcW w:type="dxa" w:w="4252"/>
+          </w:tcPr>
+          <w:p>
+            <w:r/>
+            <w:r>
+              <w:rPr>
+                <w:sz w:val="20"/>
+              </w:rPr>
+              <w:t>Número de série (só as 4 primeiras letras)</w:t>
+            </w:r>
+          </w:p>
+        </w:tc>
+        <w:tc>
+          <w:tcPr>
+            <w:tcW w:type="dxa" w:w="2835"/>
+          </w:tcPr>
+          <w:p>
+            <w:r/>
+            <w:r>
+              <w:rPr>
+                <w:sz w:val="20"/>
+              </w:rPr>
+            </w:r>
+          </w:p>
+        </w:tc>
+        <w:tc>
+          <w:tcPr>
+            <w:tcW w:type="dxa" w:w="2835"/>
+          </w:tcPr>
+          <w:p>
+            <w:r/>
+            <w:r>
+              <w:rPr>
+                <w:sz w:val="20"/>
+              </w:rPr>
+            </w:r>
+          </w:p>
+        </w:tc>
+      </w:tr>
+      <w:tr>
+        <w:trPr>
+          <w:trHeight w:val="397"/>
+        </w:trPr>
+        <w:tc>
+          <w:tcPr>
+            <w:tcW w:type="dxa" w:w="4252"/>
+          </w:tcPr>
+          <w:p>
+            <w:r/>
+            <w:r>
+              <w:rPr>
+                <w:sz w:val="20"/>
+              </w:rPr>
+              <w:t>MAC</w:t>
+            </w:r>
+          </w:p>
+        </w:tc>
+        <w:tc>
+          <w:tcPr>
+            <w:tcW w:type="dxa" w:w="2835"/>
+          </w:tcPr>
+          <w:p>
+            <w:r/>
+            <w:r>
+              <w:rPr>
+                <w:sz w:val="20"/>
+              </w:rPr>
+            </w:r>
+          </w:p>
+        </w:tc>
+        <w:tc>
+          <w:tcPr>
+            <w:tcW w:type="dxa" w:w="2835"/>
+          </w:tcPr>
+          <w:p>
+            <w:r/>
+            <w:r>
+              <w:rPr>
+                <w:sz w:val="20"/>
+              </w:rPr>
+            </w:r>
+          </w:p>
+        </w:tc>
+      </w:tr>
+      <w:tr>
+        <w:trPr>
+          <w:trHeight w:val="397"/>
+        </w:trPr>
+        <w:tc>
+          <w:tcPr>
+            <w:tcW w:type="dxa" w:w="4252"/>
+          </w:tcPr>
+          <w:p>
+            <w:r/>
+            <w:r>
+              <w:rPr>
+                <w:sz w:val="20"/>
+              </w:rPr>
+              <w:t>Alimentação (V e A)</w:t>
+            </w:r>
+          </w:p>
+        </w:tc>
+        <w:tc>
+          <w:tcPr>
+            <w:tcW w:type="dxa" w:w="2835"/>
+          </w:tcPr>
+          <w:p>
+            <w:r/>
+            <w:r>
+              <w:rPr>
+                <w:sz w:val="20"/>
+              </w:rPr>
+            </w:r>
+          </w:p>
+        </w:tc>
+        <w:tc>
+          <w:tcPr>
+            <w:tcW w:type="dxa" w:w="2835"/>
+          </w:tcPr>
+          <w:p>
+            <w:r/>
+            <w:r>
+              <w:rPr>
+                <w:sz w:val="20"/>
+              </w:rPr>
+            </w:r>
+          </w:p>
+        </w:tc>
+      </w:tr>
+      <w:tr>
+        <w:trPr>
+          <w:trHeight w:val="397"/>
+        </w:trPr>
+        <w:tc>
+          <w:tcPr>
+            <w:tcW w:type="dxa" w:w="4252"/>
+          </w:tcPr>
+          <w:p>
+            <w:r/>
+            <w:r>
+              <w:rPr>
+                <w:sz w:val="20"/>
+              </w:rPr>
+              <w:t>Quantas portas de rede (LAN)?</w:t>
+            </w:r>
+          </w:p>
+        </w:tc>
+        <w:tc>
+          <w:tcPr>
+            <w:tcW w:type="dxa" w:w="2835"/>
+          </w:tcPr>
+          <w:p>
+            <w:r/>
+            <w:r>
+              <w:rPr>
+                <w:sz w:val="20"/>
+              </w:rPr>
+            </w:r>
+          </w:p>
+        </w:tc>
+        <w:tc>
+          <w:tcPr>
+            <w:tcW w:type="dxa" w:w="2835"/>
+          </w:tcPr>
+          <w:p>
+            <w:r/>
+            <w:r>
+              <w:rPr>
+                <w:sz w:val="20"/>
+              </w:rPr>
+            </w:r>
+          </w:p>
+        </w:tc>
+      </w:tr>
+      <w:tr>
+        <w:trPr>
+          <w:trHeight w:val="397"/>
+        </w:trPr>
+        <w:tc>
+          <w:tcPr>
+            <w:tcW w:type="dxa" w:w="4252"/>
+          </w:tcPr>
+          <w:p>
+            <w:r/>
+            <w:r>
+              <w:rPr>
+                <w:sz w:val="20"/>
+              </w:rPr>
+              <w:t>Tem porta de telefone (TEL/POTS)?</w:t>
+            </w:r>
+          </w:p>
+        </w:tc>
+        <w:tc>
+          <w:tcPr>
+            <w:tcW w:type="dxa" w:w="2835"/>
+          </w:tcPr>
+          <w:p>
+            <w:r/>
+            <w:r>
+              <w:rPr>
+                <w:sz w:val="20"/>
+              </w:rPr>
+            </w:r>
+          </w:p>
+        </w:tc>
+        <w:tc>
+          <w:tcPr>
+            <w:tcW w:type="dxa" w:w="2835"/>
+          </w:tcPr>
+          <w:p>
+            <w:r/>
+            <w:r>
+              <w:rPr>
+                <w:sz w:val="20"/>
+              </w:rPr>
+            </w:r>
+          </w:p>
+        </w:tc>
+      </w:tr>
+      <w:tr>
+        <w:trPr>
+          <w:trHeight w:val="397"/>
+        </w:trPr>
+        <w:tc>
+          <w:tcPr>
+            <w:tcW w:type="dxa" w:w="4252"/>
+          </w:tcPr>
+          <w:p>
+            <w:r/>
+            <w:r>
+              <w:rPr>
+                <w:sz w:val="20"/>
+              </w:rPr>
+              <w:t>Onde entra a fibra? Cor do conector</w:t>
+            </w:r>
+          </w:p>
+        </w:tc>
+        <w:tc>
+          <w:tcPr>
+            <w:tcW w:type="dxa" w:w="2835"/>
+          </w:tcPr>
+          <w:p>
+            <w:r/>
+            <w:r>
+              <w:rPr>
+                <w:sz w:val="20"/>
+              </w:rPr>
+            </w:r>
+          </w:p>
+        </w:tc>
+        <w:tc>
+          <w:tcPr>
+            <w:tcW w:type="dxa" w:w="2835"/>
+          </w:tcPr>
+          <w:p>
+            <w:r/>
+            <w:r>
+              <w:rPr>
+                <w:sz w:val="20"/>
+              </w:rPr>
+            </w:r>
+          </w:p>
+        </w:tc>
+      </w:tr>
+    </w:tbl>
+    <w:p>
+      <w:pPr>
+        <w:spacing w:before="200" w:after="120"/>
+      </w:pPr>
+      <w:r>
+        <w:rPr>
+          <w:b/>
+          <w:color w:val="0B5C5C"/>
+          <w:sz w:val="24"/>
+        </w:rPr>
+        <w:t>3  Pense como técnico</w:t>
+      </w:r>
+    </w:p>
+    <w:p>
+      <w:r>
+        <w:rPr>
+          <w:b/>
+          <w:sz w:val="22"/>
+        </w:rPr>
+        <w:t>1. Um cliente tem o AN5506-02-B e quer Wi-Fi em casa. O que falta instalar? Onde vai ligado?</w:t>
+      </w:r>
+    </w:p>
+    <w:p>
+      <w:pPr>
+        <w:spacing w:after="0"/>
+      </w:pPr>
+      <w:r>
+        <w:rPr>
+          <w:color w:val="555555"/>
+          <w:sz w:val="22"/>
+        </w:rPr>
+        <w:t>____________________________________________________________________________________________________</w:t>
+      </w:r>
+    </w:p>
+    <w:p>
+      <w:pPr>
+        <w:spacing w:after="0"/>
+      </w:pPr>
+      <w:r>
+        <w:rPr>
+          <w:color w:val="555555"/>
+          <w:sz w:val="22"/>
+        </w:rPr>
+        <w:t>____________________________________________________________________________________________________</w:t>
+      </w:r>
+    </w:p>
+    <w:p>
+      <w:r>
+        <w:rPr>
+          <w:b/>
+          <w:sz w:val="22"/>
+        </w:rPr>
+        <w:t>2. A fonte de um modem serve no outro? Compare tensão (V) e corrente (A) dos dois e explique.</w:t>
+      </w:r>
+    </w:p>
+    <w:p>
+      <w:pPr>
+        <w:spacing w:after="0"/>
+      </w:pPr>
+      <w:r>
+        <w:rPr>
+          <w:color w:val="555555"/>
+          <w:sz w:val="22"/>
+        </w:rPr>
+        <w:t>____________________________________________________________________________________________________</w:t>
+      </w:r>
+    </w:p>
+    <w:p>
+      <w:pPr>
+        <w:spacing w:after="0"/>
+      </w:pPr>
+      <w:r>
+        <w:rPr>
+          <w:color w:val="555555"/>
+          <w:sz w:val="22"/>
+        </w:rPr>
+        <w:t>____________________________________________________________________________________________________</w:t>
+      </w:r>
+    </w:p>
+    <w:p>
+      <w:r>
+        <w:rPr>
+          <w:b/>
+          <w:sz w:val="22"/>
+        </w:rPr>
+        <w:t>3. A ONU do cliente queimou e você levou outra. Que informação da etiqueta o provedor vai pedir? Por quê?</w:t>
+      </w:r>
+    </w:p>
+    <w:p>
+      <w:pPr>
+        <w:spacing w:after="0"/>
+      </w:pPr>
+      <w:r>
+        <w:rPr>
+          <w:color w:val="555555"/>
+          <w:sz w:val="22"/>
+        </w:rPr>
+        <w:t>____________________________________________________________________________________________________</w:t>
+      </w:r>
+    </w:p>
+    <w:p>
+      <w:pPr>
+        <w:spacing w:after="0"/>
+      </w:pPr>
+      <w:r>
+        <w:rPr>
+          <w:color w:val="555555"/>
+          <w:sz w:val="22"/>
+        </w:rPr>
+        <w:t>____________________________________________________________________________________________________</w:t>
+      </w:r>
+    </w:p>
+    <w:p>
+      <w:r>
+        <w:br w:type="page"/>
+      </w:r>
+    </w:p>
+    <w:p>
+      <w:r>
+        <w:rPr>
+          <w:b/>
+          <w:color w:val="0B5C5C"/>
+          <w:sz w:val="44"/>
+        </w:rPr>
         <w:t>FICHA DE IDENTIFICAÇÃO · CABO</w:t>
       </w:r>
     </w:p>
@@ -3054,7 +3980,7 @@
           <w:color w:val="555555"/>
           <w:sz w:val="20"/>
         </w:rPr>
-        <w:t>Equipamento de rede · Noite 2 · 5 de 5</w:t>
+        <w:t>Equipamento de rede · Noite 2 · 6 de 6</w:t>
       </w:r>
     </w:p>
     <w:p>

</xml_diff>

<commit_message>
fix: Noite 2 - folha do aluno na ordem da aula e passos da pratica com pagina
Fichas passam para as paginas 2 a 5 e o role-play vai para a 6.
Cada passo da pratica indica onde anotar; linha de conferencia da troca de bancada.

Co-Authored-By: Claude Opus 5.5 <noreply@anthropic.com>
Claude-Session: https://claude.ai/code/session_015y4tKZEhCyJs3fFMDuZmcy
</commit_message>
<xml_diff>
--- a/Folha do Aluno - Redes 2 - Como a internet chega.docx
+++ b/Folha do Aluno - Redes 2 - Como a internet chega.docx
@@ -821,517 +821,6 @@
           <w:color w:val="0B5C5C"/>
           <w:sz w:val="44"/>
         </w:rPr>
-        <w:t>CHAMADOS PARA VOCÊ ATENDER</w:t>
-      </w:r>
-    </w:p>
-    <w:p>
-      <w:r>
-        <w:rPr>
-          <w:i/>
-          <w:color w:val="555555"/>
-          <w:sz w:val="20"/>
-        </w:rPr>
-        <w:t>Role-play cliente/técnico · Noite 2 · 2 de 6</w:t>
-      </w:r>
-    </w:p>
-    <w:p>
-      <w:pPr>
-        <w:pBdr>
-          <w:bottom w:val="single" w:sz="6" w:space="1" w:color="888888"/>
-        </w:pBdr>
-      </w:pPr>
-    </w:p>
-    <w:p>
-      <w:pPr>
-        <w:spacing w:after="80"/>
-      </w:pPr>
-      <w:r>
-        <w:rPr>
-          <w:b w:val="0"/>
-          <w:i/>
-          <w:color w:val="555555"/>
-          <w:sz w:val="20"/>
-        </w:rPr>
-        <w:t>Nesta atividade você faz o papel de técnico. Sua dupla recebe um cartão com o problema do cliente e vai te contar como se fosse um cliente de verdade. Sua missão: descobrir qual equipamento provavelmente está com problema, fazendo 3-4 perguntas.</w:t>
-      </w:r>
-    </w:p>
-    <w:p>
-      <w:pPr>
-        <w:spacing w:before="200" w:after="120"/>
-      </w:pPr>
-      <w:r>
-        <w:rPr>
-          <w:b/>
-          <w:color w:val="0B5C5C"/>
-          <w:sz w:val="24"/>
-        </w:rPr>
-        <w:t>Chamado 1</w:t>
-      </w:r>
-    </w:p>
-    <w:p>
-      <w:pPr>
-        <w:spacing w:after="80"/>
-      </w:pPr>
-      <w:r>
-        <w:rPr>
-          <w:b w:val="0"/>
-          <w:i/>
-          <w:color w:val="0B5C5C"/>
-          <w:sz w:val="22"/>
-        </w:rPr>
-        <w:t>"Instalei um switch em casa mas nada conecta na internet."</w:t>
-      </w:r>
-    </w:p>
-    <w:p>
-      <w:r>
-        <w:rPr>
-          <w:b/>
-          <w:sz w:val="20"/>
-        </w:rPr>
-        <w:t>Que perguntas você faria pro cliente?</w:t>
-      </w:r>
-    </w:p>
-    <w:p>
-      <w:pPr>
-        <w:spacing w:after="0"/>
-      </w:pPr>
-      <w:r>
-        <w:rPr>
-          <w:color w:val="555555"/>
-          <w:sz w:val="22"/>
-        </w:rPr>
-        <w:t>____________________________________________________________________________________________________</w:t>
-      </w:r>
-    </w:p>
-    <w:p>
-      <w:pPr>
-        <w:spacing w:after="0"/>
-      </w:pPr>
-      <w:r>
-        <w:rPr>
-          <w:color w:val="555555"/>
-          <w:sz w:val="22"/>
-        </w:rPr>
-        <w:t>____________________________________________________________________________________________________</w:t>
-      </w:r>
-    </w:p>
-    <w:p>
-      <w:r>
-        <w:rPr>
-          <w:b/>
-          <w:sz w:val="20"/>
-        </w:rPr>
-        <w:t>Qual equipamento suspeito? Por quê?</w:t>
-      </w:r>
-    </w:p>
-    <w:p>
-      <w:pPr>
-        <w:spacing w:after="0"/>
-      </w:pPr>
-      <w:r>
-        <w:rPr>
-          <w:color w:val="555555"/>
-          <w:sz w:val="22"/>
-        </w:rPr>
-        <w:t>____________________________________________________________________________________________________</w:t>
-      </w:r>
-    </w:p>
-    <w:p>
-      <w:pPr>
-        <w:spacing w:after="0"/>
-      </w:pPr>
-      <w:r>
-        <w:rPr>
-          <w:color w:val="555555"/>
-          <w:sz w:val="22"/>
-        </w:rPr>
-        <w:t>____________________________________________________________________________________________________</w:t>
-      </w:r>
-    </w:p>
-    <w:p>
-      <w:pPr>
-        <w:spacing w:before="200" w:after="120"/>
-      </w:pPr>
-      <w:r>
-        <w:rPr>
-          <w:b/>
-          <w:color w:val="0B5C5C"/>
-          <w:sz w:val="24"/>
-        </w:rPr>
-        <w:t>Chamado 2</w:t>
-      </w:r>
-    </w:p>
-    <w:p>
-      <w:pPr>
-        <w:spacing w:after="80"/>
-      </w:pPr>
-      <w:r>
-        <w:rPr>
-          <w:b w:val="0"/>
-          <w:i/>
-          <w:color w:val="0B5C5C"/>
-          <w:sz w:val="22"/>
-        </w:rPr>
-        <w:t>"O Wi-Fi tá aceso no meu celular mas nada abre."</w:t>
-      </w:r>
-    </w:p>
-    <w:p>
-      <w:r>
-        <w:rPr>
-          <w:b/>
-          <w:sz w:val="20"/>
-        </w:rPr>
-        <w:t>Que perguntas você faria pro cliente?</w:t>
-      </w:r>
-    </w:p>
-    <w:p>
-      <w:pPr>
-        <w:spacing w:after="0"/>
-      </w:pPr>
-      <w:r>
-        <w:rPr>
-          <w:color w:val="555555"/>
-          <w:sz w:val="22"/>
-        </w:rPr>
-        <w:t>____________________________________________________________________________________________________</w:t>
-      </w:r>
-    </w:p>
-    <w:p>
-      <w:pPr>
-        <w:spacing w:after="0"/>
-      </w:pPr>
-      <w:r>
-        <w:rPr>
-          <w:color w:val="555555"/>
-          <w:sz w:val="22"/>
-        </w:rPr>
-        <w:t>____________________________________________________________________________________________________</w:t>
-      </w:r>
-    </w:p>
-    <w:p>
-      <w:r>
-        <w:rPr>
-          <w:b/>
-          <w:sz w:val="20"/>
-        </w:rPr>
-        <w:t>Qual equipamento suspeito? Por quê?</w:t>
-      </w:r>
-    </w:p>
-    <w:p>
-      <w:pPr>
-        <w:spacing w:after="0"/>
-      </w:pPr>
-      <w:r>
-        <w:rPr>
-          <w:color w:val="555555"/>
-          <w:sz w:val="22"/>
-        </w:rPr>
-        <w:t>____________________________________________________________________________________________________</w:t>
-      </w:r>
-    </w:p>
-    <w:p>
-      <w:pPr>
-        <w:spacing w:after="0"/>
-      </w:pPr>
-      <w:r>
-        <w:rPr>
-          <w:color w:val="555555"/>
-          <w:sz w:val="22"/>
-        </w:rPr>
-        <w:t>____________________________________________________________________________________________________</w:t>
-      </w:r>
-    </w:p>
-    <w:p>
-      <w:pPr>
-        <w:spacing w:before="200" w:after="120"/>
-      </w:pPr>
-      <w:r>
-        <w:rPr>
-          <w:b/>
-          <w:color w:val="0B5C5C"/>
-          <w:sz w:val="24"/>
-        </w:rPr>
-        <w:t>Chamado 3</w:t>
-      </w:r>
-    </w:p>
-    <w:p>
-      <w:pPr>
-        <w:spacing w:after="80"/>
-      </w:pPr>
-      <w:r>
-        <w:rPr>
-          <w:b w:val="0"/>
-          <w:i/>
-          <w:color w:val="0B5C5C"/>
-          <w:sz w:val="22"/>
-        </w:rPr>
-        <w:t>"Comprei um roteador novo. Não sei em que porta ligar o cabo que o técnico deixou."</w:t>
-      </w:r>
-    </w:p>
-    <w:p>
-      <w:r>
-        <w:rPr>
-          <w:b/>
-          <w:sz w:val="20"/>
-        </w:rPr>
-        <w:t>Que perguntas você faria pro cliente?</w:t>
-      </w:r>
-    </w:p>
-    <w:p>
-      <w:pPr>
-        <w:spacing w:after="0"/>
-      </w:pPr>
-      <w:r>
-        <w:rPr>
-          <w:color w:val="555555"/>
-          <w:sz w:val="22"/>
-        </w:rPr>
-        <w:t>____________________________________________________________________________________________________</w:t>
-      </w:r>
-    </w:p>
-    <w:p>
-      <w:pPr>
-        <w:spacing w:after="0"/>
-      </w:pPr>
-      <w:r>
-        <w:rPr>
-          <w:color w:val="555555"/>
-          <w:sz w:val="22"/>
-        </w:rPr>
-        <w:t>____________________________________________________________________________________________________</w:t>
-      </w:r>
-    </w:p>
-    <w:p>
-      <w:r>
-        <w:rPr>
-          <w:b/>
-          <w:sz w:val="20"/>
-        </w:rPr>
-        <w:t>Qual equipamento suspeito? Por quê?</w:t>
-      </w:r>
-    </w:p>
-    <w:p>
-      <w:pPr>
-        <w:spacing w:after="0"/>
-      </w:pPr>
-      <w:r>
-        <w:rPr>
-          <w:color w:val="555555"/>
-          <w:sz w:val="22"/>
-        </w:rPr>
-        <w:t>____________________________________________________________________________________________________</w:t>
-      </w:r>
-    </w:p>
-    <w:p>
-      <w:pPr>
-        <w:spacing w:after="0"/>
-      </w:pPr>
-      <w:r>
-        <w:rPr>
-          <w:color w:val="555555"/>
-          <w:sz w:val="22"/>
-        </w:rPr>
-        <w:t>____________________________________________________________________________________________________</w:t>
-      </w:r>
-    </w:p>
-    <w:p>
-      <w:pPr>
-        <w:spacing w:before="200" w:after="120"/>
-      </w:pPr>
-      <w:r>
-        <w:rPr>
-          <w:b/>
-          <w:color w:val="0B5C5C"/>
-          <w:sz w:val="24"/>
-        </w:rPr>
-        <w:t>Chamado 4</w:t>
-      </w:r>
-    </w:p>
-    <w:p>
-      <w:pPr>
-        <w:spacing w:after="80"/>
-      </w:pPr>
-      <w:r>
-        <w:rPr>
-          <w:b w:val="0"/>
-          <w:i/>
-          <w:color w:val="0B5C5C"/>
-          <w:sz w:val="22"/>
-        </w:rPr>
-        <w:t>"A impressora do meu escritório não imprime, mas a internet funciona."</w:t>
-      </w:r>
-    </w:p>
-    <w:p>
-      <w:r>
-        <w:rPr>
-          <w:b/>
-          <w:sz w:val="20"/>
-        </w:rPr>
-        <w:t>Que perguntas você faria pro cliente?</w:t>
-      </w:r>
-    </w:p>
-    <w:p>
-      <w:pPr>
-        <w:spacing w:after="0"/>
-      </w:pPr>
-      <w:r>
-        <w:rPr>
-          <w:color w:val="555555"/>
-          <w:sz w:val="22"/>
-        </w:rPr>
-        <w:t>____________________________________________________________________________________________________</w:t>
-      </w:r>
-    </w:p>
-    <w:p>
-      <w:pPr>
-        <w:spacing w:after="0"/>
-      </w:pPr>
-      <w:r>
-        <w:rPr>
-          <w:color w:val="555555"/>
-          <w:sz w:val="22"/>
-        </w:rPr>
-        <w:t>____________________________________________________________________________________________________</w:t>
-      </w:r>
-    </w:p>
-    <w:p>
-      <w:r>
-        <w:rPr>
-          <w:b/>
-          <w:sz w:val="20"/>
-        </w:rPr>
-        <w:t>Qual equipamento suspeito? Por quê?</w:t>
-      </w:r>
-    </w:p>
-    <w:p>
-      <w:pPr>
-        <w:spacing w:after="0"/>
-      </w:pPr>
-      <w:r>
-        <w:rPr>
-          <w:color w:val="555555"/>
-          <w:sz w:val="22"/>
-        </w:rPr>
-        <w:t>____________________________________________________________________________________________________</w:t>
-      </w:r>
-    </w:p>
-    <w:p>
-      <w:pPr>
-        <w:spacing w:after="0"/>
-      </w:pPr>
-      <w:r>
-        <w:rPr>
-          <w:color w:val="555555"/>
-          <w:sz w:val="22"/>
-        </w:rPr>
-        <w:t>____________________________________________________________________________________________________</w:t>
-      </w:r>
-    </w:p>
-    <w:p>
-      <w:pPr>
-        <w:spacing w:before="200" w:after="120"/>
-      </w:pPr>
-      <w:r>
-        <w:rPr>
-          <w:b/>
-          <w:color w:val="0B5C5C"/>
-          <w:sz w:val="24"/>
-        </w:rPr>
-        <w:t>Chamado 5</w:t>
-      </w:r>
-    </w:p>
-    <w:p>
-      <w:pPr>
-        <w:spacing w:after="80"/>
-      </w:pPr>
-      <w:r>
-        <w:rPr>
-          <w:b w:val="0"/>
-          <w:i/>
-          <w:color w:val="0B5C5C"/>
-          <w:sz w:val="22"/>
-        </w:rPr>
-        <w:t>"A luz de fibra do meu roteador tá apagada. Reiniciei três vezes."</w:t>
-      </w:r>
-    </w:p>
-    <w:p>
-      <w:r>
-        <w:rPr>
-          <w:b/>
-          <w:sz w:val="20"/>
-        </w:rPr>
-        <w:t>Que perguntas você faria pro cliente?</w:t>
-      </w:r>
-    </w:p>
-    <w:p>
-      <w:pPr>
-        <w:spacing w:after="0"/>
-      </w:pPr>
-      <w:r>
-        <w:rPr>
-          <w:color w:val="555555"/>
-          <w:sz w:val="22"/>
-        </w:rPr>
-        <w:t>____________________________________________________________________________________________________</w:t>
-      </w:r>
-    </w:p>
-    <w:p>
-      <w:pPr>
-        <w:spacing w:after="0"/>
-      </w:pPr>
-      <w:r>
-        <w:rPr>
-          <w:color w:val="555555"/>
-          <w:sz w:val="22"/>
-        </w:rPr>
-        <w:t>____________________________________________________________________________________________________</w:t>
-      </w:r>
-    </w:p>
-    <w:p>
-      <w:r>
-        <w:rPr>
-          <w:b/>
-          <w:sz w:val="20"/>
-        </w:rPr>
-        <w:t>Qual equipamento suspeito? Por quê?</w:t>
-      </w:r>
-    </w:p>
-    <w:p>
-      <w:pPr>
-        <w:spacing w:after="0"/>
-      </w:pPr>
-      <w:r>
-        <w:rPr>
-          <w:color w:val="555555"/>
-          <w:sz w:val="22"/>
-        </w:rPr>
-        <w:t>____________________________________________________________________________________________________</w:t>
-      </w:r>
-    </w:p>
-    <w:p>
-      <w:pPr>
-        <w:spacing w:after="0"/>
-      </w:pPr>
-      <w:r>
-        <w:rPr>
-          <w:color w:val="555555"/>
-          <w:sz w:val="22"/>
-        </w:rPr>
-        <w:t>____________________________________________________________________________________________________</w:t>
-      </w:r>
-    </w:p>
-    <w:p>
-      <w:r>
-        <w:br w:type="page"/>
-      </w:r>
-    </w:p>
-    <w:p>
-      <w:r>
-        <w:rPr>
-          <w:b/>
-          <w:color w:val="0B5C5C"/>
-          <w:sz w:val="44"/>
-        </w:rPr>
         <w:t>FICHA DE IDENTIFICAÇÃO · ROTEADOR</w:t>
       </w:r>
     </w:p>
@@ -1342,7 +831,7 @@
           <w:color w:val="555555"/>
           <w:sz w:val="20"/>
         </w:rPr>
-        <w:t>Equipamento de rede · Noite 2 · 3 de 6</w:t>
+        <w:t>Equipamento de rede · Noite 2 · 2 de 6</w:t>
       </w:r>
     </w:p>
     <w:p>
@@ -2409,7 +1898,7 @@
           <w:color w:val="555555"/>
           <w:sz w:val="20"/>
         </w:rPr>
-        <w:t>Equipamento de rede · Noite 2 · 4 de 6</w:t>
+        <w:t>Equipamento de rede · Noite 2 · 3 de 6</w:t>
       </w:r>
     </w:p>
     <w:p>
@@ -3054,7 +2543,7 @@
           <w:color w:val="555555"/>
           <w:sz w:val="20"/>
         </w:rPr>
-        <w:t>Equipamento de rede · Noite 2 · 5 de 6</w:t>
+        <w:t>Equipamento de rede · Noite 2 · 4 de 6</w:t>
       </w:r>
     </w:p>
     <w:p>
@@ -3980,7 +3469,7 @@
           <w:color w:val="555555"/>
           <w:sz w:val="20"/>
         </w:rPr>
-        <w:t>Equipamento de rede · Noite 2 · 6 de 6</w:t>
+        <w:t>Equipamento de rede · Noite 2 · 5 de 6</w:t>
       </w:r>
     </w:p>
     <w:p>
@@ -5017,7 +4506,531 @@
         <w:t>____________________________________________________________________________________________________</w:t>
       </w:r>
     </w:p>
-    <w:p/>
+    <w:p>
+      <w:pPr>
+        <w:spacing w:after="80"/>
+      </w:pPr>
+      <w:r>
+        <w:rPr>
+          <w:b/>
+          <w:i w:val="0"/>
+          <w:color w:val="0B5C5C"/>
+          <w:sz w:val="20"/>
+        </w:rPr>
+        <w:t>Troca de bancada — conferido pela equipe de: ______________________________   Corrigimos ___ itens.</w:t>
+      </w:r>
+    </w:p>
+    <w:p>
+      <w:r>
+        <w:br w:type="page"/>
+      </w:r>
+    </w:p>
+    <w:p>
+      <w:r>
+        <w:rPr>
+          <w:b/>
+          <w:color w:val="0B5C5C"/>
+          <w:sz w:val="44"/>
+        </w:rPr>
+        <w:t>CHAMADOS PARA VOCÊ ATENDER</w:t>
+      </w:r>
+    </w:p>
+    <w:p>
+      <w:r>
+        <w:rPr>
+          <w:i/>
+          <w:color w:val="555555"/>
+          <w:sz w:val="20"/>
+        </w:rPr>
+        <w:t>Role-play cliente/técnico · Noite 2 · 6 de 6</w:t>
+      </w:r>
+    </w:p>
+    <w:p>
+      <w:pPr>
+        <w:pBdr>
+          <w:bottom w:val="single" w:sz="6" w:space="1" w:color="888888"/>
+        </w:pBdr>
+      </w:pPr>
+    </w:p>
+    <w:p>
+      <w:pPr>
+        <w:spacing w:after="80"/>
+      </w:pPr>
+      <w:r>
+        <w:rPr>
+          <w:b w:val="0"/>
+          <w:i/>
+          <w:color w:val="555555"/>
+          <w:sz w:val="20"/>
+        </w:rPr>
+        <w:t>Nesta atividade você faz o papel de técnico. Sua dupla recebe um cartão com o problema do cliente e vai te contar como se fosse um cliente de verdade. Sua missão: descobrir qual equipamento provavelmente está com problema, fazendo 3-4 perguntas.</w:t>
+      </w:r>
+    </w:p>
+    <w:p>
+      <w:pPr>
+        <w:spacing w:before="200" w:after="120"/>
+      </w:pPr>
+      <w:r>
+        <w:rPr>
+          <w:b/>
+          <w:color w:val="0B5C5C"/>
+          <w:sz w:val="24"/>
+        </w:rPr>
+        <w:t>Chamado 1</w:t>
+      </w:r>
+    </w:p>
+    <w:p>
+      <w:pPr>
+        <w:spacing w:after="80"/>
+      </w:pPr>
+      <w:r>
+        <w:rPr>
+          <w:b w:val="0"/>
+          <w:i/>
+          <w:color w:val="0B5C5C"/>
+          <w:sz w:val="22"/>
+        </w:rPr>
+        <w:t>"Instalei um switch em casa mas nada conecta na internet."</w:t>
+      </w:r>
+    </w:p>
+    <w:p>
+      <w:r>
+        <w:rPr>
+          <w:b/>
+          <w:sz w:val="20"/>
+        </w:rPr>
+        <w:t>Que perguntas você faria pro cliente?</w:t>
+      </w:r>
+    </w:p>
+    <w:p>
+      <w:pPr>
+        <w:spacing w:after="0"/>
+      </w:pPr>
+      <w:r>
+        <w:rPr>
+          <w:color w:val="555555"/>
+          <w:sz w:val="22"/>
+        </w:rPr>
+        <w:t>____________________________________________________________________________________________________</w:t>
+      </w:r>
+    </w:p>
+    <w:p>
+      <w:pPr>
+        <w:spacing w:after="0"/>
+      </w:pPr>
+      <w:r>
+        <w:rPr>
+          <w:color w:val="555555"/>
+          <w:sz w:val="22"/>
+        </w:rPr>
+        <w:t>____________________________________________________________________________________________________</w:t>
+      </w:r>
+    </w:p>
+    <w:p>
+      <w:r>
+        <w:rPr>
+          <w:b/>
+          <w:sz w:val="20"/>
+        </w:rPr>
+        <w:t>Qual equipamento suspeito? Por quê?</w:t>
+      </w:r>
+    </w:p>
+    <w:p>
+      <w:pPr>
+        <w:spacing w:after="0"/>
+      </w:pPr>
+      <w:r>
+        <w:rPr>
+          <w:color w:val="555555"/>
+          <w:sz w:val="22"/>
+        </w:rPr>
+        <w:t>____________________________________________________________________________________________________</w:t>
+      </w:r>
+    </w:p>
+    <w:p>
+      <w:pPr>
+        <w:spacing w:after="0"/>
+      </w:pPr>
+      <w:r>
+        <w:rPr>
+          <w:color w:val="555555"/>
+          <w:sz w:val="22"/>
+        </w:rPr>
+        <w:t>____________________________________________________________________________________________________</w:t>
+      </w:r>
+    </w:p>
+    <w:p>
+      <w:pPr>
+        <w:spacing w:before="200" w:after="120"/>
+      </w:pPr>
+      <w:r>
+        <w:rPr>
+          <w:b/>
+          <w:color w:val="0B5C5C"/>
+          <w:sz w:val="24"/>
+        </w:rPr>
+        <w:t>Chamado 2</w:t>
+      </w:r>
+    </w:p>
+    <w:p>
+      <w:pPr>
+        <w:spacing w:after="80"/>
+      </w:pPr>
+      <w:r>
+        <w:rPr>
+          <w:b w:val="0"/>
+          <w:i/>
+          <w:color w:val="0B5C5C"/>
+          <w:sz w:val="22"/>
+        </w:rPr>
+        <w:t>"O Wi-Fi tá aceso no meu celular mas nada abre."</w:t>
+      </w:r>
+    </w:p>
+    <w:p>
+      <w:r>
+        <w:rPr>
+          <w:b/>
+          <w:sz w:val="20"/>
+        </w:rPr>
+        <w:t>Que perguntas você faria pro cliente?</w:t>
+      </w:r>
+    </w:p>
+    <w:p>
+      <w:pPr>
+        <w:spacing w:after="0"/>
+      </w:pPr>
+      <w:r>
+        <w:rPr>
+          <w:color w:val="555555"/>
+          <w:sz w:val="22"/>
+        </w:rPr>
+        <w:t>____________________________________________________________________________________________________</w:t>
+      </w:r>
+    </w:p>
+    <w:p>
+      <w:pPr>
+        <w:spacing w:after="0"/>
+      </w:pPr>
+      <w:r>
+        <w:rPr>
+          <w:color w:val="555555"/>
+          <w:sz w:val="22"/>
+        </w:rPr>
+        <w:t>____________________________________________________________________________________________________</w:t>
+      </w:r>
+    </w:p>
+    <w:p>
+      <w:r>
+        <w:rPr>
+          <w:b/>
+          <w:sz w:val="20"/>
+        </w:rPr>
+        <w:t>Qual equipamento suspeito? Por quê?</w:t>
+      </w:r>
+    </w:p>
+    <w:p>
+      <w:pPr>
+        <w:spacing w:after="0"/>
+      </w:pPr>
+      <w:r>
+        <w:rPr>
+          <w:color w:val="555555"/>
+          <w:sz w:val="22"/>
+        </w:rPr>
+        <w:t>____________________________________________________________________________________________________</w:t>
+      </w:r>
+    </w:p>
+    <w:p>
+      <w:pPr>
+        <w:spacing w:after="0"/>
+      </w:pPr>
+      <w:r>
+        <w:rPr>
+          <w:color w:val="555555"/>
+          <w:sz w:val="22"/>
+        </w:rPr>
+        <w:t>____________________________________________________________________________________________________</w:t>
+      </w:r>
+    </w:p>
+    <w:p>
+      <w:pPr>
+        <w:spacing w:before="200" w:after="120"/>
+      </w:pPr>
+      <w:r>
+        <w:rPr>
+          <w:b/>
+          <w:color w:val="0B5C5C"/>
+          <w:sz w:val="24"/>
+        </w:rPr>
+        <w:t>Chamado 3</w:t>
+      </w:r>
+    </w:p>
+    <w:p>
+      <w:pPr>
+        <w:spacing w:after="80"/>
+      </w:pPr>
+      <w:r>
+        <w:rPr>
+          <w:b w:val="0"/>
+          <w:i/>
+          <w:color w:val="0B5C5C"/>
+          <w:sz w:val="22"/>
+        </w:rPr>
+        <w:t>"Comprei um roteador novo. Não sei em que porta ligar o cabo que o técnico deixou."</w:t>
+      </w:r>
+    </w:p>
+    <w:p>
+      <w:r>
+        <w:rPr>
+          <w:b/>
+          <w:sz w:val="20"/>
+        </w:rPr>
+        <w:t>Que perguntas você faria pro cliente?</w:t>
+      </w:r>
+    </w:p>
+    <w:p>
+      <w:pPr>
+        <w:spacing w:after="0"/>
+      </w:pPr>
+      <w:r>
+        <w:rPr>
+          <w:color w:val="555555"/>
+          <w:sz w:val="22"/>
+        </w:rPr>
+        <w:t>____________________________________________________________________________________________________</w:t>
+      </w:r>
+    </w:p>
+    <w:p>
+      <w:pPr>
+        <w:spacing w:after="0"/>
+      </w:pPr>
+      <w:r>
+        <w:rPr>
+          <w:color w:val="555555"/>
+          <w:sz w:val="22"/>
+        </w:rPr>
+        <w:t>____________________________________________________________________________________________________</w:t>
+      </w:r>
+    </w:p>
+    <w:p>
+      <w:r>
+        <w:rPr>
+          <w:b/>
+          <w:sz w:val="20"/>
+        </w:rPr>
+        <w:t>Qual equipamento suspeito? Por quê?</w:t>
+      </w:r>
+    </w:p>
+    <w:p>
+      <w:pPr>
+        <w:spacing w:after="0"/>
+      </w:pPr>
+      <w:r>
+        <w:rPr>
+          <w:color w:val="555555"/>
+          <w:sz w:val="22"/>
+        </w:rPr>
+        <w:t>____________________________________________________________________________________________________</w:t>
+      </w:r>
+    </w:p>
+    <w:p>
+      <w:pPr>
+        <w:spacing w:after="0"/>
+      </w:pPr>
+      <w:r>
+        <w:rPr>
+          <w:color w:val="555555"/>
+          <w:sz w:val="22"/>
+        </w:rPr>
+        <w:t>____________________________________________________________________________________________________</w:t>
+      </w:r>
+    </w:p>
+    <w:p>
+      <w:pPr>
+        <w:spacing w:before="200" w:after="120"/>
+      </w:pPr>
+      <w:r>
+        <w:rPr>
+          <w:b/>
+          <w:color w:val="0B5C5C"/>
+          <w:sz w:val="24"/>
+        </w:rPr>
+        <w:t>Chamado 4</w:t>
+      </w:r>
+    </w:p>
+    <w:p>
+      <w:pPr>
+        <w:spacing w:after="80"/>
+      </w:pPr>
+      <w:r>
+        <w:rPr>
+          <w:b w:val="0"/>
+          <w:i/>
+          <w:color w:val="0B5C5C"/>
+          <w:sz w:val="22"/>
+        </w:rPr>
+        <w:t>"A impressora do meu escritório não imprime, mas a internet funciona."</w:t>
+      </w:r>
+    </w:p>
+    <w:p>
+      <w:r>
+        <w:rPr>
+          <w:b/>
+          <w:sz w:val="20"/>
+        </w:rPr>
+        <w:t>Que perguntas você faria pro cliente?</w:t>
+      </w:r>
+    </w:p>
+    <w:p>
+      <w:pPr>
+        <w:spacing w:after="0"/>
+      </w:pPr>
+      <w:r>
+        <w:rPr>
+          <w:color w:val="555555"/>
+          <w:sz w:val="22"/>
+        </w:rPr>
+        <w:t>____________________________________________________________________________________________________</w:t>
+      </w:r>
+    </w:p>
+    <w:p>
+      <w:pPr>
+        <w:spacing w:after="0"/>
+      </w:pPr>
+      <w:r>
+        <w:rPr>
+          <w:color w:val="555555"/>
+          <w:sz w:val="22"/>
+        </w:rPr>
+        <w:t>____________________________________________________________________________________________________</w:t>
+      </w:r>
+    </w:p>
+    <w:p>
+      <w:r>
+        <w:rPr>
+          <w:b/>
+          <w:sz w:val="20"/>
+        </w:rPr>
+        <w:t>Qual equipamento suspeito? Por quê?</w:t>
+      </w:r>
+    </w:p>
+    <w:p>
+      <w:pPr>
+        <w:spacing w:after="0"/>
+      </w:pPr>
+      <w:r>
+        <w:rPr>
+          <w:color w:val="555555"/>
+          <w:sz w:val="22"/>
+        </w:rPr>
+        <w:t>____________________________________________________________________________________________________</w:t>
+      </w:r>
+    </w:p>
+    <w:p>
+      <w:pPr>
+        <w:spacing w:after="0"/>
+      </w:pPr>
+      <w:r>
+        <w:rPr>
+          <w:color w:val="555555"/>
+          <w:sz w:val="22"/>
+        </w:rPr>
+        <w:t>____________________________________________________________________________________________________</w:t>
+      </w:r>
+    </w:p>
+    <w:p>
+      <w:pPr>
+        <w:spacing w:before="200" w:after="120"/>
+      </w:pPr>
+      <w:r>
+        <w:rPr>
+          <w:b/>
+          <w:color w:val="0B5C5C"/>
+          <w:sz w:val="24"/>
+        </w:rPr>
+        <w:t>Chamado 5</w:t>
+      </w:r>
+    </w:p>
+    <w:p>
+      <w:pPr>
+        <w:spacing w:after="80"/>
+      </w:pPr>
+      <w:r>
+        <w:rPr>
+          <w:b w:val="0"/>
+          <w:i/>
+          <w:color w:val="0B5C5C"/>
+          <w:sz w:val="22"/>
+        </w:rPr>
+        <w:t>"A luz de fibra do meu roteador tá apagada. Reiniciei três vezes."</w:t>
+      </w:r>
+    </w:p>
+    <w:p>
+      <w:r>
+        <w:rPr>
+          <w:b/>
+          <w:sz w:val="20"/>
+        </w:rPr>
+        <w:t>Que perguntas você faria pro cliente?</w:t>
+      </w:r>
+    </w:p>
+    <w:p>
+      <w:pPr>
+        <w:spacing w:after="0"/>
+      </w:pPr>
+      <w:r>
+        <w:rPr>
+          <w:color w:val="555555"/>
+          <w:sz w:val="22"/>
+        </w:rPr>
+        <w:t>____________________________________________________________________________________________________</w:t>
+      </w:r>
+    </w:p>
+    <w:p>
+      <w:pPr>
+        <w:spacing w:after="0"/>
+      </w:pPr>
+      <w:r>
+        <w:rPr>
+          <w:color w:val="555555"/>
+          <w:sz w:val="22"/>
+        </w:rPr>
+        <w:t>____________________________________________________________________________________________________</w:t>
+      </w:r>
+    </w:p>
+    <w:p>
+      <w:r>
+        <w:rPr>
+          <w:b/>
+          <w:sz w:val="20"/>
+        </w:rPr>
+        <w:t>Qual equipamento suspeito? Por quê?</w:t>
+      </w:r>
+    </w:p>
+    <w:p>
+      <w:pPr>
+        <w:spacing w:after="0"/>
+      </w:pPr>
+      <w:r>
+        <w:rPr>
+          <w:color w:val="555555"/>
+          <w:sz w:val="22"/>
+        </w:rPr>
+        <w:t>____________________________________________________________________________________________________</w:t>
+      </w:r>
+    </w:p>
+    <w:p>
+      <w:pPr>
+        <w:spacing w:after="0"/>
+      </w:pPr>
+      <w:r>
+        <w:rPr>
+          <w:color w:val="555555"/>
+          <w:sz w:val="22"/>
+        </w:rPr>
+        <w:t>____________________________________________________________________________________________________</w:t>
+      </w:r>
+    </w:p>
     <w:p>
       <w:pPr>
         <w:jc w:val="center"/>

</xml_diff>